<commit_message>
Add academic report, presentation, and speech script
- report.docx: 10-page academic report (A4, TNR 12pt, single spacing)
  Sections: Introduction, Problem Statement, Proposed GenAI Agent,
  System Design and Prompt Description, Demo, References
- presentation.pptx: 10-slide Midnight Executive theme
  Covers: Introduction, Problem, Agent Architecture, Decision Model,
  System Design, Tools, Prompt, Demo, Conclusion
- speech.md: 5-minute presentation script (~900 words)
- Generator scripts included for reproducibility

Co-Authored-By: Claude Opus 4.6 <noreply@anthropic.com>
</commit_message>
<xml_diff>
--- a/docs/report.docx
+++ b/docs/report.docx
@@ -21,7 +21,7 @@
           <w:sz w:val="48"/>
           <w:szCs w:val="48"/>
         </w:rPr>
-        <w:t xml:space="preserve">LiteClaw: A Lightweight Generative AI Agent Framework</w:t>
+        <w:t xml:space="preserve">LiteClaw: A Lightweight WhatsApp-Driven GenAI Agent Framework</w:t>
       </w:r>
     </w:p>
     <w:p>
@@ -38,7 +38,7 @@
           <w:sz w:val="28"/>
           <w:szCs w:val="28"/>
         </w:rPr>
-        <w:t xml:space="preserve">Design, Implementation, and Evaluation of an Autonomous Tool-Using Agent</w:t>
+        <w:t xml:space="preserve">Design, Implementation, and Evaluation of a Structured Decision Agent with Local Tool Execution</w:t>
       </w:r>
     </w:p>
     <w:p>
@@ -129,35 +129,49 @@
           <w:sz w:val="24"/>
           <w:szCs w:val="24"/>
         </w:rPr>
-        <w:t xml:space="preserve">The emergence of Large Language Models (LLMs) has catalyzed a paradigm shift in artificial intelligence, moving beyond passive text generation toward autonomous agents capable of reasoning about complex tasks and taking concrete actions in the real world. Central to this advancement is the ReAct (Reasoning + Acting) paradigm, introduced by Yao et al. (2023), which demonstrates that LLMs can interleave chain-of-thought reasoning with tool invocations to solve multi-step problems. In the ReAct framework, an agent iteratively observes its environment, reasons about the current state, selects and executes an appropriate action, and incorporates the result into its ongoing reasoning chain. This approach has proven remarkably effective for tasks ranging from web navigation and code generation to system administration and research assistance.</w:t>
-      </w:r>
-    </w:p>
-    <w:p>
-      <w:pPr>
-        <w:spacing w:after="120" w:line="240"/>
-      </w:pPr>
-      <w:r>
-        <w:rPr>
-          <w:rFonts w:ascii="Times New Roman" w:cs="Times New Roman" w:eastAsia="Times New Roman" w:hAnsi="Times New Roman"/>
-          <w:color w:val="000000"/>
-          <w:sz w:val="24"/>
-          <w:szCs w:val="24"/>
-        </w:rPr>
-        <w:t xml:space="preserve">The growing demand for AI agents has spawned numerous open-source frameworks that attempt to productionize this capability. OpenClaw, one of the most comprehensive agent frameworks available, provides extensive functionality including multi-modal tool support, advanced memory systems, and enterprise-grade observability. However, this comprehensiveness comes at a significant cost: OpenClaw comprises approximately 500,000 lines of code across more than 70 dependencies, creating a substantial barrier to entry for developers seeking to understand, customize, or deploy AI agents. At the other end of the spectrum, NanoClaw offers a minimalist alternative with roughly 3,900 lines of code spread across 15 files, demonstrating that the core agent loop can be implemented with far less complexity. Yet NanoClaw sacrifices important features such as web interfaces, persistent memory, and multi-provider LLM support.</w:t>
-      </w:r>
-    </w:p>
-    <w:p>
-      <w:pPr>
-        <w:spacing w:after="120" w:line="240"/>
-      </w:pPr>
-      <w:r>
-        <w:rPr>
-          <w:rFonts w:ascii="Times New Roman" w:cs="Times New Roman" w:eastAsia="Times New Roman" w:hAnsi="Times New Roman"/>
-          <w:color w:val="000000"/>
-          <w:sz w:val="24"/>
-          <w:szCs w:val="24"/>
-        </w:rPr>
-        <w:t xml:space="preserve">This paper introduces LiteClaw, a lightweight generative AI agent framework implemented in approximately 2,000 lines of TypeScript that bridges the gap between these extremes. LiteClaw provides a fully functional autonomous agent with the following contributions:</w:t>
+        <w:t xml:space="preserve">The emergence of Large Language Models (LLMs) has catalyzed a paradigm shift in artificial intelligence, moving beyond passive text generation toward autonomous agents capable of reasoning about complex tasks and taking concrete actions in the real world. Central to this advancement is the ReAct (Reasoning + Acting) paradigm, introduced by Yao et al. (2023), which demonstrates that LLMs can interleave chain-of-thought reasoning with tool invocations to solve multi-step problems.</w:t>
+      </w:r>
+    </w:p>
+    <w:p>
+      <w:pPr>
+        <w:spacing w:after="120" w:line="240"/>
+      </w:pPr>
+      <w:r>
+        <w:rPr>
+          <w:rFonts w:ascii="Times New Roman" w:cs="Times New Roman" w:eastAsia="Times New Roman" w:hAnsi="Times New Roman"/>
+          <w:color w:val="000000"/>
+          <w:sz w:val="24"/>
+          <w:szCs w:val="24"/>
+        </w:rPr>
+        <w:t xml:space="preserve">The growing demand for AI agents has spawned numerous open-source frameworks. OpenClaw, one of the most comprehensive, comprises approximately 500,000 lines of code across more than 70 dependencies, creating a substantial barrier to entry. NanoClaw offers a minimalist alternative with roughly 3,900 lines, but sacrifices important features such as persistent memory and multi-provider support. A significant gap remains between these extremes: developers need agent frameworks that are small enough to read in an afternoon yet capable enough for real-world use.</w:t>
+      </w:r>
+    </w:p>
+    <w:p>
+      <w:pPr>
+        <w:spacing w:after="120" w:line="240"/>
+      </w:pPr>
+      <w:r>
+        <w:rPr>
+          <w:rFonts w:ascii="Times New Roman" w:cs="Times New Roman" w:eastAsia="Times New Roman" w:hAnsi="Times New Roman"/>
+          <w:color w:val="000000"/>
+          <w:sz w:val="24"/>
+          <w:szCs w:val="24"/>
+        </w:rPr>
+        <w:t xml:space="preserve">Beyond complexity, a fundamental limitation persists in how users interact with AI agents. Nearly all existing frameworks rely on web-based or terminal interfaces, requiring users to be at a computer. Yet WhatsApp, the world’s most popular messaging platform with over 2 billion active users, offers an ideal delivery channel for personal AI assistance — accessible from any smartphone, anywhere, at any time.</w:t>
+      </w:r>
+    </w:p>
+    <w:p>
+      <w:pPr>
+        <w:spacing w:after="120" w:line="240"/>
+      </w:pPr>
+      <w:r>
+        <w:rPr>
+          <w:rFonts w:ascii="Times New Roman" w:cs="Times New Roman" w:eastAsia="Times New Roman" w:hAnsi="Times New Roman"/>
+          <w:color w:val="000000"/>
+          <w:sz w:val="24"/>
+          <w:szCs w:val="24"/>
+        </w:rPr>
+        <w:t xml:space="preserve">This paper introduces LiteClaw, a lightweight WhatsApp-driven GenAI agent framework implemented in approximately 1,800 lines of TypeScript. LiteClaw makes the following contributions:</w:t>
       </w:r>
     </w:p>
     <w:p>
@@ -182,7 +196,7 @@
           <w:sz w:val="24"/>
           <w:szCs w:val="24"/>
         </w:rPr>
-        <w:t xml:space="preserve">Multi-provider LLM integration supporting both free APIs (Groq, Google Gemini) and paid providers (DeepSeek, Anthropic) through a unified adapter pattern; </w:t>
+        <w:t xml:space="preserve">A single-decision JSON architecture where the LLM outputs exactly one structured response per turn (reply, tool call, or schedule command), replacing unpredictable multi-turn agentic loops; </w:t>
       </w:r>
     </w:p>
     <w:p>
@@ -207,7 +221,7 @@
           <w:sz w:val="24"/>
           <w:szCs w:val="24"/>
         </w:rPr>
-        <w:t xml:space="preserve">Four built-in tools enabling shell command execution, file operations, web access, and persistent memory; </w:t>
+        <w:t xml:space="preserve">Multi-provider LLM integration supporting free APIs (Groq, Google Gemini) and paid providers (Anthropic) through a unified adapter pattern; </w:t>
       </w:r>
     </w:p>
     <w:p>
@@ -232,7 +246,7 @@
           <w:sz w:val="24"/>
           <w:szCs w:val="24"/>
         </w:rPr>
-        <w:t xml:space="preserve">A real-time web interface with WebSocket streaming that provides live visibility into the agent’s reasoning and tool execution; </w:t>
+        <w:t xml:space="preserve">Four local-only tools (file operations, todo management, notes, time/reminders) with Zod schema validation, eliminating dangerous shell and web access; </w:t>
       </w:r>
     </w:p>
     <w:p>
@@ -257,7 +271,7 @@
           <w:sz w:val="24"/>
           <w:szCs w:val="24"/>
         </w:rPr>
-        <w:t xml:space="preserve">A markdown-based persistent memory system requiring no database infrastructure; and </w:t>
+        <w:t xml:space="preserve">A default-deny authorization (AuthZ) permission wall that validates every tool call before execution; and </w:t>
       </w:r>
     </w:p>
     <w:p>
@@ -282,7 +296,7 @@
           <w:sz w:val="24"/>
           <w:szCs w:val="24"/>
         </w:rPr>
-        <w:t xml:space="preserve">An extensible skill system that allows behavioral extensions through natural language markdown files without writing code.</w:t>
+        <w:t xml:space="preserve">WhatsApp delivery via the Baileys library with cron-based proactive reminders, making the assistant accessible from any phone.</w:t>
       </w:r>
     </w:p>
     <w:p>
@@ -299,7 +313,7 @@
           <w:sz w:val="24"/>
           <w:szCs w:val="24"/>
         </w:rPr>
-        <w:t xml:space="preserve">[Figure 1: Screenshot of LiteClaw web chat interface — to be inserted]</w:t>
+        <w:t xml:space="preserve">[Figure 1: System overview — WhatsApp message flow through LiteClaw’s single-decision pipeline — to be inserted]</w:t>
       </w:r>
     </w:p>
     <w:p>
@@ -330,7 +344,7 @@
           <w:sz w:val="24"/>
           <w:szCs w:val="24"/>
         </w:rPr>
-        <w:t xml:space="preserve">Despite the rapid proliferation of AI agent frameworks, a significant gap remains in the development landscape. Production-grade frameworks demand heavy infrastructure, deep software engineering expertise, and typically require paid API access to function. This creates three fundamental challenges that LiteClaw seeks to address.</w:t>
+        <w:t xml:space="preserve">Despite the rapid proliferation of AI agent frameworks, four fundamental challenges prevent their adoption as practical personal assistants.</w:t>
       </w:r>
     </w:p>
     <w:p>
@@ -346,16 +360,16 @@
           <w:sz w:val="24"/>
           <w:szCs w:val="24"/>
         </w:rPr>
-        <w:t xml:space="preserve">Challenge 1: LLM Provider Lock-in. </w:t>
-      </w:r>
-      <w:r>
-        <w:rPr>
-          <w:rFonts w:ascii="Times New Roman" w:cs="Times New Roman" w:eastAsia="Times New Roman" w:hAnsi="Times New Roman"/>
-          <w:color w:val="000000"/>
-          <w:sz w:val="24"/>
-          <w:szCs w:val="24"/>
-        </w:rPr>
-        <w:t xml:space="preserve">The majority of existing agent frameworks are tightly coupled to a single LLM provider, most commonly OpenAI or Anthropic. This architectural decision creates cost dependency, as developers must maintain paid API subscriptions to use the framework at all. It also introduces a single point of failure: if the provider experiences downtime or changes its pricing, the entire agent system becomes unavailable. Furthermore, provider lock-in prevents developers from leveraging emerging free-tier offerings from providers such as Groq and Google Gemini, which offer competitive model quality at zero cost for moderate usage volumes.</w:t>
+        <w:t xml:space="preserve">Challenge 1: Framework Complexity. </w:t>
+      </w:r>
+      <w:r>
+        <w:rPr>
+          <w:rFonts w:ascii="Times New Roman" w:cs="Times New Roman" w:eastAsia="Times New Roman" w:hAnsi="Times New Roman"/>
+          <w:color w:val="000000"/>
+          <w:sz w:val="24"/>
+          <w:szCs w:val="24"/>
+        </w:rPr>
+        <w:t xml:space="preserve">Production-grade agent frameworks demand massive codebases and deep software engineering expertise. OpenClaw requires approximately 500,000 lines of code and over 70 dependencies, making it impractical for individual developers to understand, customize, or deploy. Even experienced engineers report spending weeks navigating such codebases before making meaningful contributions. This complexity creates a paradox: the frameworks designed to make AI agents accessible are themselves inaccessible to most developers.</w:t>
       </w:r>
     </w:p>
     <w:p>
@@ -380,7 +394,7 @@
           <w:sz w:val="24"/>
           <w:szCs w:val="24"/>
         </w:rPr>
-        <w:t xml:space="preserve">AI agents that interact with the host operating system through shell commands and file modifications pose inherent security risks. An agent that can execute arbitrary shell commands could, through hallucination or prompt injection, run destructive operations such as recursive file deletion or disk formatting. Similarly, file operation tools must prevent path traversal attacks that could allow the agent to read or modify files outside its designated workspace. Existing frameworks address these concerns with varying degrees of rigor, but lightweight implementations often omit safety measures entirely, making them unsuitable for any environment beyond controlled experimentation.</w:t>
+        <w:t xml:space="preserve">AI agents that interact with the host operating system through shell commands and web access pose inherent security risks. An agent with shell access could, through hallucination or prompt injection, execute destructive operations such as recursive file deletion or unauthorized network requests. Path traversal vulnerabilities in file operation tools could allow the agent to access sensitive files outside its designated workspace. Multi-turn agentic loops compound this risk: a single user message may trigger dozens of tool executions, each representing a potential attack surface. Existing lightweight frameworks often omit safety measures entirely, while comprehensive frameworks implement complex but incomplete sandboxing.</w:t>
       </w:r>
     </w:p>
     <w:p>
@@ -396,16 +410,41 @@
           <w:sz w:val="24"/>
           <w:szCs w:val="24"/>
         </w:rPr>
-        <w:t xml:space="preserve">Challenge 3: Complexity versus Capability Tradeoff. </w:t>
-      </w:r>
-      <w:r>
-        <w:rPr>
-          <w:rFonts w:ascii="Times New Roman" w:cs="Times New Roman" w:eastAsia="Times New Roman" w:hAnsi="Times New Roman"/>
-          <w:color w:val="000000"/>
-          <w:sz w:val="24"/>
-          <w:szCs w:val="24"/>
-        </w:rPr>
-        <w:t xml:space="preserve">Developers who wish to build, understand, or customize AI agents face a difficult choice. Comprehensive frameworks like OpenClaw provide rich functionality but require significant investment to comprehend and modify. Minimal implementations like NanoClaw are easily understood but lack essential features for practical use. The development community needs agent frameworks that are small enough to read in an afternoon yet capable enough to handle real-world tasks including web research, file management, and persistent knowledge retention.</w:t>
+        <w:t xml:space="preserve">Challenge 3: Interaction Accessibility. </w:t>
+      </w:r>
+      <w:r>
+        <w:rPr>
+          <w:rFonts w:ascii="Times New Roman" w:cs="Times New Roman" w:eastAsia="Times New Roman" w:hAnsi="Times New Roman"/>
+          <w:color w:val="000000"/>
+          <w:sz w:val="24"/>
+          <w:szCs w:val="24"/>
+        </w:rPr>
+        <w:t xml:space="preserve">Web-UI agents require users to be seated at a computer with a browser open. Terminal-based agents demand even more technical sophistication. Neither paradigm serves the most natural use case for a personal AI assistant: quick, mobile interactions throughout the day. WhatsApp, used by over 2 billion people across 180 countries, offers a universally familiar interface that requires no installation, no browser, and no technical setup beyond scanning a QR code. Yet no lightweight agent framework delivers AI assistance through WhatsApp natively.</w:t>
+      </w:r>
+    </w:p>
+    <w:p>
+      <w:pPr>
+        <w:spacing w:after="120" w:line="240"/>
+      </w:pPr>
+      <w:r>
+        <w:rPr>
+          <w:rFonts w:ascii="Times New Roman" w:cs="Times New Roman" w:eastAsia="Times New Roman" w:hAnsi="Times New Roman"/>
+          <w:b/>
+          <w:bCs/>
+          <w:color w:val="000000"/>
+          <w:sz w:val="24"/>
+          <w:szCs w:val="24"/>
+        </w:rPr>
+        <w:t xml:space="preserve">Challenge 4: LLM Provider Lock-in. </w:t>
+      </w:r>
+      <w:r>
+        <w:rPr>
+          <w:rFonts w:ascii="Times New Roman" w:cs="Times New Roman" w:eastAsia="Times New Roman" w:hAnsi="Times New Roman"/>
+          <w:color w:val="000000"/>
+          <w:sz w:val="24"/>
+          <w:szCs w:val="24"/>
+        </w:rPr>
+        <w:t xml:space="preserve">Most agent frameworks are tightly coupled to paid LLM providers, typically OpenAI or Anthropic. This creates cost barriers for students, hobbyists, and developers in regions where these APIs are restricted. Free-tier offerings from Groq (Llama models) and Google Gemini provide competitive quality at zero cost for moderate usage, but few frameworks support them as first-class providers.</w:t>
       </w:r>
     </w:p>
     <w:p>
@@ -434,7 +473,7 @@
           <w:sz w:val="24"/>
           <w:szCs w:val="24"/>
         </w:rPr>
-        <w:t xml:space="preserve">“Can a sub-3,000-line agent framework support autonomous multi-tool reasoning while integrating free LLM APIs?”</w:t>
+        <w:t xml:space="preserve">“Can a sub-2,000-line agent framework deliver secure, WhatsApp-native personal AI assistance with free LLM support?”</w:t>
       </w:r>
     </w:p>
     <w:p>
@@ -482,159 +521,21 @@
           <w:sz w:val="24"/>
           <w:szCs w:val="24"/>
         </w:rPr>
-        <w:t xml:space="preserve">LiteClaw adopts a single-process, event-driven architecture built on Node.js and TypeScript. The decision to use a single-process design eliminates the operational complexity of microservices while maintaining clean module boundaries through TypeScript’s type system. The system is organized into six principal modules, each responsible for a distinct aspect of agent functionality.</w:t>
-      </w:r>
-    </w:p>
-    <w:p>
-      <w:pPr>
-        <w:spacing w:after="120" w:line="240"/>
-      </w:pPr>
-      <w:r>
-        <w:rPr>
-          <w:rFonts w:ascii="Times New Roman" w:cs="Times New Roman" w:eastAsia="Times New Roman" w:hAnsi="Times New Roman"/>
-          <w:color w:val="000000"/>
-          <w:sz w:val="24"/>
-          <w:szCs w:val="24"/>
-        </w:rPr>
-        <w:t xml:space="preserve">The Core Agent Loop serves as the central reasoning engine, implementing the ReAct-style iterative cycle of reasoning and action. The LLM Client provides a multi-provider abstraction layer that normalizes the varying API formats of different language model providers into a unified interface. The Tool Registry manages tool discovery and dispatch, maintaining a registry of available tools and routing execution requests from the LLM to the appropriate tool implementation. The Memory Manager handles persistent storage of facts and conversation history using a lightweight markdown-based approach. The Skill Loader parses markdown-based plugin files that extend the agent’s behavioral repertoire without requiring code changes. Finally, the Channel System provides the interface layer, supporting both an interactive command-line interface and a web-based chat interface with real-time streaming.</w:t>
-      </w:r>
-    </w:p>
-    <w:p>
-      <w:pPr>
-        <w:spacing w:after="120" w:before="120" w:line="240"/>
-        <w:jc w:val="center"/>
-      </w:pPr>
-      <w:r>
-        <w:rPr>
-          <w:rFonts w:ascii="Times New Roman" w:cs="Times New Roman" w:eastAsia="Times New Roman" w:hAnsi="Times New Roman"/>
-          <w:i/>
-          <w:iCs/>
-          <w:color w:val="000000"/>
-          <w:sz w:val="24"/>
-          <w:szCs w:val="24"/>
-        </w:rPr>
-        <w:t xml:space="preserve">[Figure 2: System architecture diagram showing Agent Loop, LLM Client, Tool Registry, Memory Manager, Skill Loader, and Channel System — to be inserted]</w:t>
-      </w:r>
-    </w:p>
-    <w:p>
-      <w:pPr>
-        <w:spacing w:after="120" w:before="240" w:line="240"/>
-        <w:jc w:val="left"/>
-      </w:pPr>
-      <w:r>
-        <w:rPr>
-          <w:rFonts w:ascii="Times New Roman" w:cs="Times New Roman" w:eastAsia="Times New Roman" w:hAnsi="Times New Roman"/>
-          <w:b/>
-          <w:bCs/>
-          <w:color w:val="000000"/>
-          <w:sz w:val="28"/>
-          <w:szCs w:val="28"/>
-        </w:rPr>
-        <w:t xml:space="preserve">3.2 Agentic Loop Design</w:t>
-      </w:r>
-    </w:p>
-    <w:p>
-      <w:pPr>
-        <w:spacing w:after="120" w:line="240"/>
-      </w:pPr>
-      <w:r>
-        <w:rPr>
-          <w:rFonts w:ascii="Times New Roman" w:cs="Times New Roman" w:eastAsia="Times New Roman" w:hAnsi="Times New Roman"/>
-          <w:color w:val="000000"/>
-          <w:sz w:val="24"/>
-          <w:szCs w:val="24"/>
-        </w:rPr>
-        <w:t xml:space="preserve">The agentic loop implements a ReAct-style iterative reasoning cycle with configurable depth limits. When a user message arrives, the agent enters a processing loop that may execute up to maxToolDepth iterations, with a default value of 10. This upper bound prevents infinite loops in cases where the LLM repeatedly requests tool executions without converging on a final response.</w:t>
-      </w:r>
-    </w:p>
-    <w:p>
-      <w:pPr>
-        <w:spacing w:after="120" w:line="240"/>
-      </w:pPr>
-      <w:r>
-        <w:rPr>
-          <w:rFonts w:ascii="Times New Roman" w:cs="Times New Roman" w:eastAsia="Times New Roman" w:hAnsi="Times New Roman"/>
-          <w:color w:val="000000"/>
-          <w:sz w:val="24"/>
-          <w:szCs w:val="24"/>
-        </w:rPr>
-        <w:t xml:space="preserve">Each iteration of the loop proceeds as follows. First, the agent constructs a message payload containing the system prompt, the full conversation history (including any prior tool results), and the JSON schema definitions of all registered tools. This payload is sent to the configured LLM provider via the unified LLM Client interface. Second, the agent parses the LLM’s response, separating it into text content blocks and tool_use blocks. Third, if tool_use blocks are present, the agent executes each requested tool sequentially through the Tool Registry, collecting the results. These results are formatted as tool_result messages and appended to the conversation history, after which the loop returns to the first step for another LLM invocation. Fourth, if no tool_use blocks are present in the response, the agent treats the text content as the final response and exits the loop.</w:t>
-      </w:r>
-    </w:p>
-    <w:p>
-      <w:pPr>
-        <w:spacing w:after="120" w:line="240"/>
-      </w:pPr>
-      <w:r>
-        <w:rPr>
-          <w:rFonts w:ascii="Times New Roman" w:cs="Times New Roman" w:eastAsia="Times New Roman" w:hAnsi="Times New Roman"/>
-          <w:color w:val="000000"/>
-          <w:sz w:val="24"/>
-          <w:szCs w:val="24"/>
-        </w:rPr>
-        <w:t xml:space="preserve">The agent maintains a four-state machine throughout this process: idle (awaiting input), thinking (LLM inference in progress), tool_execution (a tool is being executed), and responding (final response ready). State transitions are broadcast via an event emitter, enabling the web interface to display real-time status indicators to the user.</w:t>
-      </w:r>
-    </w:p>
-    <w:p>
-      <w:pPr>
-        <w:spacing w:after="120" w:before="120" w:line="240"/>
-        <w:jc w:val="center"/>
-      </w:pPr>
-      <w:r>
-        <w:rPr>
-          <w:rFonts w:ascii="Times New Roman" w:cs="Times New Roman" w:eastAsia="Times New Roman" w:hAnsi="Times New Roman"/>
-          <w:i/>
-          <w:iCs/>
-          <w:color w:val="000000"/>
-          <w:sz w:val="24"/>
-          <w:szCs w:val="24"/>
-        </w:rPr>
-        <w:t xml:space="preserve">[Figure 3: Flowchart of the agentic loop — User Message → LLM Call → Tool Calls? → Yes: Execute Tools → Loop Back / No: Return Response — to be inserted]</w:t>
-      </w:r>
-    </w:p>
-    <w:p>
-      <w:pPr>
-        <w:spacing w:after="120" w:before="240" w:line="240"/>
-        <w:jc w:val="left"/>
-      </w:pPr>
-      <w:r>
-        <w:rPr>
-          <w:rFonts w:ascii="Times New Roman" w:cs="Times New Roman" w:eastAsia="Times New Roman" w:hAnsi="Times New Roman"/>
-          <w:b/>
-          <w:bCs/>
-          <w:color w:val="000000"/>
-          <w:sz w:val="28"/>
-          <w:szCs w:val="28"/>
-        </w:rPr>
-        <w:t xml:space="preserve">3.3 Multi-Provider LLM Integration</w:t>
-      </w:r>
-    </w:p>
-    <w:p>
-      <w:pPr>
-        <w:spacing w:after="120" w:line="240"/>
-      </w:pPr>
-      <w:r>
-        <w:rPr>
-          <w:rFonts w:ascii="Times New Roman" w:cs="Times New Roman" w:eastAsia="Times New Roman" w:hAnsi="Times New Roman"/>
-          <w:color w:val="000000"/>
-          <w:sz w:val="24"/>
-          <w:szCs w:val="24"/>
-        </w:rPr>
-        <w:t xml:space="preserve">LiteClaw employs the adapter pattern to support multiple LLM providers through a unified interface. The LLMClient interface defines a single chat() method that accepts a system prompt string, an array of conversation messages, and an array of tool definitions. It returns a standardized LLMResponse containing an array of ContentBlock elements (either TextBlock or ToolUseBlock), a stop reason indicator, and token usage statistics.</w:t>
-      </w:r>
-    </w:p>
-    <w:p>
-      <w:pPr>
-        <w:spacing w:after="120" w:line="240"/>
-      </w:pPr>
-      <w:r>
-        <w:rPr>
-          <w:rFonts w:ascii="Times New Roman" w:cs="Times New Roman" w:eastAsia="Times New Roman" w:hAnsi="Times New Roman"/>
-          <w:color w:val="000000"/>
-          <w:sz w:val="24"/>
-          <w:szCs w:val="24"/>
-        </w:rPr>
-        <w:t xml:space="preserve">Two concrete implementations of this interface exist. The AnthropicClient uses the native Anthropic SDK (@anthropic-ai/sdk) and maps directly between Anthropic’s message format and the unified content block representation. The OpenAICompatibleClient leverages the OpenAI SDK configured with custom base URLs, enabling it to communicate with any provider that implements the OpenAI chat completions API. This single client class serves Groq, Google Gemini, and DeepSeek, each differing only in their base URL and default model selection. A factory function, createLLMClient(), examines the provider configuration and instantiates the appropriate client. Table 1 summarizes the supported providers.</w:t>
+        <w:t xml:space="preserve">LiteClaw adopts a linear pipeline architecture that processes each user message through a deterministic sequence of stages: WhatsApp Channel Adapter (message reception and allowlist filtering) → Agent Core (context loading, LLM invocation, decision parsing) → AuthZ Wall (permission validation) → Tool Execution (local-only) → Response Sender (WhatsApp delivery). This pipeline replaces the traditional ReAct-style iterative loop with a single-pass, single-decision model that bounds execution to exactly one LLM call and at most one tool invocation per user message.</w:t>
+      </w:r>
+    </w:p>
+    <w:p>
+      <w:pPr>
+        <w:spacing w:after="120" w:line="240"/>
+      </w:pPr>
+      <w:r>
+        <w:rPr>
+          <w:rFonts w:ascii="Times New Roman" w:cs="Times New Roman" w:eastAsia="Times New Roman" w:hAnsi="Times New Roman"/>
+          <w:color w:val="000000"/>
+          <w:sz w:val="24"/>
+          <w:szCs w:val="24"/>
+        </w:rPr>
+        <w:t xml:space="preserve">The system is organized into ten modules, each with a clearly defined responsibility. Table 1 summarizes the module architecture.</w:t>
       </w:r>
     </w:p>
     <w:p>
@@ -653,7 +554,1185 @@
           <w:sz w:val="24"/>
           <w:szCs w:val="24"/>
         </w:rPr>
-        <w:t xml:space="preserve">Table 1: Supported LLM Providers</w:t>
+        <w:t xml:space="preserve">Table 1: Module Architecture</w:t>
+      </w:r>
+    </w:p>
+    <w:tbl>
+      <w:tblPr>
+        <w:tblW w:type="dxa" w:w="9026"/>
+        <w:tblBorders>
+          <w:top w:val="single" w:color="auto" w:sz="4"/>
+          <w:left w:val="single" w:color="auto" w:sz="4"/>
+          <w:bottom w:val="single" w:color="auto" w:sz="4"/>
+          <w:right w:val="single" w:color="auto" w:sz="4"/>
+          <w:insideH w:val="single" w:color="auto" w:sz="4"/>
+          <w:insideV w:val="single" w:color="auto" w:sz="4"/>
+        </w:tblBorders>
+      </w:tblPr>
+      <w:tblGrid>
+        <w:gridCol w:w="2000"/>
+        <w:gridCol w:w="3526"/>
+        <w:gridCol w:w="3500"/>
+      </w:tblGrid>
+      <w:tr>
+        <w:tc>
+          <w:tcPr>
+            <w:tcW w:type="dxa" w:w="2000"/>
+            <w:tcBorders>
+              <w:top w:val="single" w:color="000000" w:sz="1"/>
+              <w:left w:val="single" w:color="000000" w:sz="1"/>
+              <w:bottom w:val="single" w:color="000000" w:sz="1"/>
+              <w:right w:val="single" w:color="000000" w:sz="1"/>
+            </w:tcBorders>
+            <w:shd w:fill="D9E2F3" w:val="clear"/>
+            <w:tcMar>
+              <w:top w:type="dxa" w:w="40"/>
+              <w:left w:type="dxa" w:w="80"/>
+              <w:bottom w:type="dxa" w:w="40"/>
+              <w:right w:type="dxa" w:w="80"/>
+            </w:tcMar>
+          </w:tcPr>
+          <w:p>
+            <w:pPr>
+              <w:spacing w:line="240"/>
+            </w:pPr>
+            <w:r>
+              <w:rPr>
+                <w:rFonts w:ascii="Times New Roman" w:cs="Times New Roman" w:eastAsia="Times New Roman" w:hAnsi="Times New Roman"/>
+                <w:b/>
+                <w:bCs/>
+                <w:color w:val="000000"/>
+                <w:sz w:val="24"/>
+                <w:szCs w:val="24"/>
+              </w:rPr>
+              <w:t xml:space="preserve">Module</w:t>
+            </w:r>
+          </w:p>
+        </w:tc>
+        <w:tc>
+          <w:tcPr>
+            <w:tcW w:type="dxa" w:w="3526"/>
+            <w:tcBorders>
+              <w:top w:val="single" w:color="000000" w:sz="1"/>
+              <w:left w:val="single" w:color="000000" w:sz="1"/>
+              <w:bottom w:val="single" w:color="000000" w:sz="1"/>
+              <w:right w:val="single" w:color="000000" w:sz="1"/>
+            </w:tcBorders>
+            <w:shd w:fill="D9E2F3" w:val="clear"/>
+            <w:tcMar>
+              <w:top w:type="dxa" w:w="40"/>
+              <w:left w:type="dxa" w:w="80"/>
+              <w:bottom w:type="dxa" w:w="40"/>
+              <w:right w:type="dxa" w:w="80"/>
+            </w:tcMar>
+          </w:tcPr>
+          <w:p>
+            <w:pPr>
+              <w:spacing w:line="240"/>
+            </w:pPr>
+            <w:r>
+              <w:rPr>
+                <w:rFonts w:ascii="Times New Roman" w:cs="Times New Roman" w:eastAsia="Times New Roman" w:hAnsi="Times New Roman"/>
+                <w:b/>
+                <w:bCs/>
+                <w:color w:val="000000"/>
+                <w:sz w:val="24"/>
+                <w:szCs w:val="24"/>
+              </w:rPr>
+              <w:t xml:space="preserve">File(s)</w:t>
+            </w:r>
+          </w:p>
+        </w:tc>
+        <w:tc>
+          <w:tcPr>
+            <w:tcW w:type="dxa" w:w="3500"/>
+            <w:tcBorders>
+              <w:top w:val="single" w:color="000000" w:sz="1"/>
+              <w:left w:val="single" w:color="000000" w:sz="1"/>
+              <w:bottom w:val="single" w:color="000000" w:sz="1"/>
+              <w:right w:val="single" w:color="000000" w:sz="1"/>
+            </w:tcBorders>
+            <w:shd w:fill="D9E2F3" w:val="clear"/>
+            <w:tcMar>
+              <w:top w:type="dxa" w:w="40"/>
+              <w:left w:type="dxa" w:w="80"/>
+              <w:bottom w:type="dxa" w:w="40"/>
+              <w:right w:type="dxa" w:w="80"/>
+            </w:tcMar>
+          </w:tcPr>
+          <w:p>
+            <w:pPr>
+              <w:spacing w:line="240"/>
+            </w:pPr>
+            <w:r>
+              <w:rPr>
+                <w:rFonts w:ascii="Times New Roman" w:cs="Times New Roman" w:eastAsia="Times New Roman" w:hAnsi="Times New Roman"/>
+                <w:b/>
+                <w:bCs/>
+                <w:color w:val="000000"/>
+                <w:sz w:val="24"/>
+                <w:szCs w:val="24"/>
+              </w:rPr>
+              <w:t xml:space="preserve">Responsibility</w:t>
+            </w:r>
+          </w:p>
+        </w:tc>
+      </w:tr>
+      <w:tr>
+        <w:tc>
+          <w:tcPr>
+            <w:tcW w:type="dxa" w:w="2000"/>
+            <w:tcBorders>
+              <w:top w:val="single" w:color="000000" w:sz="1"/>
+              <w:left w:val="single" w:color="000000" w:sz="1"/>
+              <w:bottom w:val="single" w:color="000000" w:sz="1"/>
+              <w:right w:val="single" w:color="000000" w:sz="1"/>
+            </w:tcBorders>
+            <w:tcMar>
+              <w:top w:type="dxa" w:w="40"/>
+              <w:left w:type="dxa" w:w="80"/>
+              <w:bottom w:type="dxa" w:w="40"/>
+              <w:right w:type="dxa" w:w="80"/>
+            </w:tcMar>
+          </w:tcPr>
+          <w:p>
+            <w:pPr>
+              <w:spacing w:line="240"/>
+            </w:pPr>
+            <w:r>
+              <w:rPr>
+                <w:rFonts w:ascii="Times New Roman" w:cs="Times New Roman" w:eastAsia="Times New Roman" w:hAnsi="Times New Roman"/>
+                <w:color w:val="000000"/>
+                <w:sz w:val="24"/>
+                <w:szCs w:val="24"/>
+              </w:rPr>
+              <w:t xml:space="preserve">Agent Core</w:t>
+            </w:r>
+          </w:p>
+        </w:tc>
+        <w:tc>
+          <w:tcPr>
+            <w:tcW w:type="dxa" w:w="3526"/>
+            <w:tcBorders>
+              <w:top w:val="single" w:color="000000" w:sz="1"/>
+              <w:left w:val="single" w:color="000000" w:sz="1"/>
+              <w:bottom w:val="single" w:color="000000" w:sz="1"/>
+              <w:right w:val="single" w:color="000000" w:sz="1"/>
+            </w:tcBorders>
+            <w:tcMar>
+              <w:top w:type="dxa" w:w="40"/>
+              <w:left w:type="dxa" w:w="80"/>
+              <w:bottom w:type="dxa" w:w="40"/>
+              <w:right w:type="dxa" w:w="80"/>
+            </w:tcMar>
+          </w:tcPr>
+          <w:p>
+            <w:pPr>
+              <w:spacing w:line="240"/>
+            </w:pPr>
+            <w:r>
+              <w:rPr>
+                <w:rFonts w:ascii="Times New Roman" w:cs="Times New Roman" w:eastAsia="Times New Roman" w:hAnsi="Times New Roman"/>
+                <w:color w:val="000000"/>
+                <w:sz w:val="24"/>
+                <w:szCs w:val="24"/>
+              </w:rPr>
+              <w:t xml:space="preserve">agent.ts, decision.ts</w:t>
+            </w:r>
+          </w:p>
+        </w:tc>
+        <w:tc>
+          <w:tcPr>
+            <w:tcW w:type="dxa" w:w="3500"/>
+            <w:tcBorders>
+              <w:top w:val="single" w:color="000000" w:sz="1"/>
+              <w:left w:val="single" w:color="000000" w:sz="1"/>
+              <w:bottom w:val="single" w:color="000000" w:sz="1"/>
+              <w:right w:val="single" w:color="000000" w:sz="1"/>
+            </w:tcBorders>
+            <w:tcMar>
+              <w:top w:type="dxa" w:w="40"/>
+              <w:left w:type="dxa" w:w="80"/>
+              <w:bottom w:type="dxa" w:w="40"/>
+              <w:right w:type="dxa" w:w="80"/>
+            </w:tcMar>
+          </w:tcPr>
+          <w:p>
+            <w:pPr>
+              <w:spacing w:line="240"/>
+            </w:pPr>
+            <w:r>
+              <w:rPr>
+                <w:rFonts w:ascii="Times New Roman" w:cs="Times New Roman" w:eastAsia="Times New Roman" w:hAnsi="Times New Roman"/>
+                <w:color w:val="000000"/>
+                <w:sz w:val="24"/>
+                <w:szCs w:val="24"/>
+              </w:rPr>
+              <w:t xml:space="preserve">Single-decision flow, JSON parsing, fallback</w:t>
+            </w:r>
+          </w:p>
+        </w:tc>
+      </w:tr>
+      <w:tr>
+        <w:tc>
+          <w:tcPr>
+            <w:tcW w:type="dxa" w:w="2000"/>
+            <w:tcBorders>
+              <w:top w:val="single" w:color="000000" w:sz="1"/>
+              <w:left w:val="single" w:color="000000" w:sz="1"/>
+              <w:bottom w:val="single" w:color="000000" w:sz="1"/>
+              <w:right w:val="single" w:color="000000" w:sz="1"/>
+            </w:tcBorders>
+            <w:tcMar>
+              <w:top w:type="dxa" w:w="40"/>
+              <w:left w:type="dxa" w:w="80"/>
+              <w:bottom w:type="dxa" w:w="40"/>
+              <w:right w:type="dxa" w:w="80"/>
+            </w:tcMar>
+          </w:tcPr>
+          <w:p>
+            <w:pPr>
+              <w:spacing w:line="240"/>
+            </w:pPr>
+            <w:r>
+              <w:rPr>
+                <w:rFonts w:ascii="Times New Roman" w:cs="Times New Roman" w:eastAsia="Times New Roman" w:hAnsi="Times New Roman"/>
+                <w:color w:val="000000"/>
+                <w:sz w:val="24"/>
+                <w:szCs w:val="24"/>
+              </w:rPr>
+              <w:t xml:space="preserve">LLM Client</w:t>
+            </w:r>
+          </w:p>
+        </w:tc>
+        <w:tc>
+          <w:tcPr>
+            <w:tcW w:type="dxa" w:w="3526"/>
+            <w:tcBorders>
+              <w:top w:val="single" w:color="000000" w:sz="1"/>
+              <w:left w:val="single" w:color="000000" w:sz="1"/>
+              <w:bottom w:val="single" w:color="000000" w:sz="1"/>
+              <w:right w:val="single" w:color="000000" w:sz="1"/>
+            </w:tcBorders>
+            <w:tcMar>
+              <w:top w:type="dxa" w:w="40"/>
+              <w:left w:type="dxa" w:w="80"/>
+              <w:bottom w:type="dxa" w:w="40"/>
+              <w:right w:type="dxa" w:w="80"/>
+            </w:tcMar>
+          </w:tcPr>
+          <w:p>
+            <w:pPr>
+              <w:spacing w:line="240"/>
+            </w:pPr>
+            <w:r>
+              <w:rPr>
+                <w:rFonts w:ascii="Times New Roman" w:cs="Times New Roman" w:eastAsia="Times New Roman" w:hAnsi="Times New Roman"/>
+                <w:color w:val="000000"/>
+                <w:sz w:val="24"/>
+                <w:szCs w:val="24"/>
+              </w:rPr>
+              <w:t xml:space="preserve">llm.ts</w:t>
+            </w:r>
+          </w:p>
+        </w:tc>
+        <w:tc>
+          <w:tcPr>
+            <w:tcW w:type="dxa" w:w="3500"/>
+            <w:tcBorders>
+              <w:top w:val="single" w:color="000000" w:sz="1"/>
+              <w:left w:val="single" w:color="000000" w:sz="1"/>
+              <w:bottom w:val="single" w:color="000000" w:sz="1"/>
+              <w:right w:val="single" w:color="000000" w:sz="1"/>
+            </w:tcBorders>
+            <w:tcMar>
+              <w:top w:type="dxa" w:w="40"/>
+              <w:left w:type="dxa" w:w="80"/>
+              <w:bottom w:type="dxa" w:w="40"/>
+              <w:right w:type="dxa" w:w="80"/>
+            </w:tcMar>
+          </w:tcPr>
+          <w:p>
+            <w:pPr>
+              <w:spacing w:line="240"/>
+            </w:pPr>
+            <w:r>
+              <w:rPr>
+                <w:rFonts w:ascii="Times New Roman" w:cs="Times New Roman" w:eastAsia="Times New Roman" w:hAnsi="Times New Roman"/>
+                <w:color w:val="000000"/>
+                <w:sz w:val="24"/>
+                <w:szCs w:val="24"/>
+              </w:rPr>
+              <w:t xml:space="preserve">Multi-provider adapter (Groq, Gemini, Anthropic)</w:t>
+            </w:r>
+          </w:p>
+        </w:tc>
+      </w:tr>
+      <w:tr>
+        <w:tc>
+          <w:tcPr>
+            <w:tcW w:type="dxa" w:w="2000"/>
+            <w:tcBorders>
+              <w:top w:val="single" w:color="000000" w:sz="1"/>
+              <w:left w:val="single" w:color="000000" w:sz="1"/>
+              <w:bottom w:val="single" w:color="000000" w:sz="1"/>
+              <w:right w:val="single" w:color="000000" w:sz="1"/>
+            </w:tcBorders>
+            <w:tcMar>
+              <w:top w:type="dxa" w:w="40"/>
+              <w:left w:type="dxa" w:w="80"/>
+              <w:bottom w:type="dxa" w:w="40"/>
+              <w:right w:type="dxa" w:w="80"/>
+            </w:tcMar>
+          </w:tcPr>
+          <w:p>
+            <w:pPr>
+              <w:spacing w:line="240"/>
+            </w:pPr>
+            <w:r>
+              <w:rPr>
+                <w:rFonts w:ascii="Times New Roman" w:cs="Times New Roman" w:eastAsia="Times New Roman" w:hAnsi="Times New Roman"/>
+                <w:color w:val="000000"/>
+                <w:sz w:val="24"/>
+                <w:szCs w:val="24"/>
+              </w:rPr>
+              <w:t xml:space="preserve">AuthZ</w:t>
+            </w:r>
+          </w:p>
+        </w:tc>
+        <w:tc>
+          <w:tcPr>
+            <w:tcW w:type="dxa" w:w="3526"/>
+            <w:tcBorders>
+              <w:top w:val="single" w:color="000000" w:sz="1"/>
+              <w:left w:val="single" w:color="000000" w:sz="1"/>
+              <w:bottom w:val="single" w:color="000000" w:sz="1"/>
+              <w:right w:val="single" w:color="000000" w:sz="1"/>
+            </w:tcBorders>
+            <w:tcMar>
+              <w:top w:type="dxa" w:w="40"/>
+              <w:left w:type="dxa" w:w="80"/>
+              <w:bottom w:type="dxa" w:w="40"/>
+              <w:right w:type="dxa" w:w="80"/>
+            </w:tcMar>
+          </w:tcPr>
+          <w:p>
+            <w:pPr>
+              <w:spacing w:line="240"/>
+            </w:pPr>
+            <w:r>
+              <w:rPr>
+                <w:rFonts w:ascii="Times New Roman" w:cs="Times New Roman" w:eastAsia="Times New Roman" w:hAnsi="Times New Roman"/>
+                <w:color w:val="000000"/>
+                <w:sz w:val="24"/>
+                <w:szCs w:val="24"/>
+              </w:rPr>
+              <w:t xml:space="preserve">authz.ts</w:t>
+            </w:r>
+          </w:p>
+        </w:tc>
+        <w:tc>
+          <w:tcPr>
+            <w:tcW w:type="dxa" w:w="3500"/>
+            <w:tcBorders>
+              <w:top w:val="single" w:color="000000" w:sz="1"/>
+              <w:left w:val="single" w:color="000000" w:sz="1"/>
+              <w:bottom w:val="single" w:color="000000" w:sz="1"/>
+              <w:right w:val="single" w:color="000000" w:sz="1"/>
+            </w:tcBorders>
+            <w:tcMar>
+              <w:top w:type="dxa" w:w="40"/>
+              <w:left w:type="dxa" w:w="80"/>
+              <w:bottom w:type="dxa" w:w="40"/>
+              <w:right w:type="dxa" w:w="80"/>
+            </w:tcMar>
+          </w:tcPr>
+          <w:p>
+            <w:pPr>
+              <w:spacing w:line="240"/>
+            </w:pPr>
+            <w:r>
+              <w:rPr>
+                <w:rFonts w:ascii="Times New Roman" w:cs="Times New Roman" w:eastAsia="Times New Roman" w:hAnsi="Times New Roman"/>
+                <w:color w:val="000000"/>
+                <w:sz w:val="24"/>
+                <w:szCs w:val="24"/>
+              </w:rPr>
+              <w:t xml:space="preserve">Default-deny permission wall, path validation</w:t>
+            </w:r>
+          </w:p>
+        </w:tc>
+      </w:tr>
+      <w:tr>
+        <w:tc>
+          <w:tcPr>
+            <w:tcW w:type="dxa" w:w="2000"/>
+            <w:tcBorders>
+              <w:top w:val="single" w:color="000000" w:sz="1"/>
+              <w:left w:val="single" w:color="000000" w:sz="1"/>
+              <w:bottom w:val="single" w:color="000000" w:sz="1"/>
+              <w:right w:val="single" w:color="000000" w:sz="1"/>
+            </w:tcBorders>
+            <w:tcMar>
+              <w:top w:type="dxa" w:w="40"/>
+              <w:left w:type="dxa" w:w="80"/>
+              <w:bottom w:type="dxa" w:w="40"/>
+              <w:right w:type="dxa" w:w="80"/>
+            </w:tcMar>
+          </w:tcPr>
+          <w:p>
+            <w:pPr>
+              <w:spacing w:line="240"/>
+            </w:pPr>
+            <w:r>
+              <w:rPr>
+                <w:rFonts w:ascii="Times New Roman" w:cs="Times New Roman" w:eastAsia="Times New Roman" w:hAnsi="Times New Roman"/>
+                <w:color w:val="000000"/>
+                <w:sz w:val="24"/>
+                <w:szCs w:val="24"/>
+              </w:rPr>
+              <w:t xml:space="preserve">Tool Registry</w:t>
+            </w:r>
+          </w:p>
+        </w:tc>
+        <w:tc>
+          <w:tcPr>
+            <w:tcW w:type="dxa" w:w="3526"/>
+            <w:tcBorders>
+              <w:top w:val="single" w:color="000000" w:sz="1"/>
+              <w:left w:val="single" w:color="000000" w:sz="1"/>
+              <w:bottom w:val="single" w:color="000000" w:sz="1"/>
+              <w:right w:val="single" w:color="000000" w:sz="1"/>
+            </w:tcBorders>
+            <w:tcMar>
+              <w:top w:type="dxa" w:w="40"/>
+              <w:left w:type="dxa" w:w="80"/>
+              <w:bottom w:type="dxa" w:w="40"/>
+              <w:right w:type="dxa" w:w="80"/>
+            </w:tcMar>
+          </w:tcPr>
+          <w:p>
+            <w:pPr>
+              <w:spacing w:line="240"/>
+            </w:pPr>
+            <w:r>
+              <w:rPr>
+                <w:rFonts w:ascii="Times New Roman" w:cs="Times New Roman" w:eastAsia="Times New Roman" w:hAnsi="Times New Roman"/>
+                <w:color w:val="000000"/>
+                <w:sz w:val="24"/>
+                <w:szCs w:val="24"/>
+              </w:rPr>
+              <w:t xml:space="preserve">tool-registry.ts, _base.ts</w:t>
+            </w:r>
+          </w:p>
+        </w:tc>
+        <w:tc>
+          <w:tcPr>
+            <w:tcW w:type="dxa" w:w="3500"/>
+            <w:tcBorders>
+              <w:top w:val="single" w:color="000000" w:sz="1"/>
+              <w:left w:val="single" w:color="000000" w:sz="1"/>
+              <w:bottom w:val="single" w:color="000000" w:sz="1"/>
+              <w:right w:val="single" w:color="000000" w:sz="1"/>
+            </w:tcBorders>
+            <w:tcMar>
+              <w:top w:type="dxa" w:w="40"/>
+              <w:left w:type="dxa" w:w="80"/>
+              <w:bottom w:type="dxa" w:w="40"/>
+              <w:right w:type="dxa" w:w="80"/>
+            </w:tcMar>
+          </w:tcPr>
+          <w:p>
+            <w:pPr>
+              <w:spacing w:line="240"/>
+            </w:pPr>
+            <w:r>
+              <w:rPr>
+                <w:rFonts w:ascii="Times New Roman" w:cs="Times New Roman" w:eastAsia="Times New Roman" w:hAnsi="Times New Roman"/>
+                <w:color w:val="000000"/>
+                <w:sz w:val="24"/>
+                <w:szCs w:val="24"/>
+              </w:rPr>
+              <w:t xml:space="preserve">Tool discovery, dispatch, timeout management</w:t>
+            </w:r>
+          </w:p>
+        </w:tc>
+      </w:tr>
+      <w:tr>
+        <w:tc>
+          <w:tcPr>
+            <w:tcW w:type="dxa" w:w="2000"/>
+            <w:tcBorders>
+              <w:top w:val="single" w:color="000000" w:sz="1"/>
+              <w:left w:val="single" w:color="000000" w:sz="1"/>
+              <w:bottom w:val="single" w:color="000000" w:sz="1"/>
+              <w:right w:val="single" w:color="000000" w:sz="1"/>
+            </w:tcBorders>
+            <w:tcMar>
+              <w:top w:type="dxa" w:w="40"/>
+              <w:left w:type="dxa" w:w="80"/>
+              <w:bottom w:type="dxa" w:w="40"/>
+              <w:right w:type="dxa" w:w="80"/>
+            </w:tcMar>
+          </w:tcPr>
+          <w:p>
+            <w:pPr>
+              <w:spacing w:line="240"/>
+            </w:pPr>
+            <w:r>
+              <w:rPr>
+                <w:rFonts w:ascii="Times New Roman" w:cs="Times New Roman" w:eastAsia="Times New Roman" w:hAnsi="Times New Roman"/>
+                <w:color w:val="000000"/>
+                <w:sz w:val="24"/>
+                <w:szCs w:val="24"/>
+              </w:rPr>
+              <w:t xml:space="preserve">Memory</w:t>
+            </w:r>
+          </w:p>
+        </w:tc>
+        <w:tc>
+          <w:tcPr>
+            <w:tcW w:type="dxa" w:w="3526"/>
+            <w:tcBorders>
+              <w:top w:val="single" w:color="000000" w:sz="1"/>
+              <w:left w:val="single" w:color="000000" w:sz="1"/>
+              <w:bottom w:val="single" w:color="000000" w:sz="1"/>
+              <w:right w:val="single" w:color="000000" w:sz="1"/>
+            </w:tcBorders>
+            <w:tcMar>
+              <w:top w:type="dxa" w:w="40"/>
+              <w:left w:type="dxa" w:w="80"/>
+              <w:bottom w:type="dxa" w:w="40"/>
+              <w:right w:type="dxa" w:w="80"/>
+            </w:tcMar>
+          </w:tcPr>
+          <w:p>
+            <w:pPr>
+              <w:spacing w:line="240"/>
+            </w:pPr>
+            <w:r>
+              <w:rPr>
+                <w:rFonts w:ascii="Times New Roman" w:cs="Times New Roman" w:eastAsia="Times New Roman" w:hAnsi="Times New Roman"/>
+                <w:color w:val="000000"/>
+                <w:sz w:val="24"/>
+                <w:szCs w:val="24"/>
+              </w:rPr>
+              <w:t xml:space="preserve">memory-manager.ts, context-loader.ts</w:t>
+            </w:r>
+          </w:p>
+        </w:tc>
+        <w:tc>
+          <w:tcPr>
+            <w:tcW w:type="dxa" w:w="3500"/>
+            <w:tcBorders>
+              <w:top w:val="single" w:color="000000" w:sz="1"/>
+              <w:left w:val="single" w:color="000000" w:sz="1"/>
+              <w:bottom w:val="single" w:color="000000" w:sz="1"/>
+              <w:right w:val="single" w:color="000000" w:sz="1"/>
+            </w:tcBorders>
+            <w:tcMar>
+              <w:top w:type="dxa" w:w="40"/>
+              <w:left w:type="dxa" w:w="80"/>
+              <w:bottom w:type="dxa" w:w="40"/>
+              <w:right w:type="dxa" w:w="80"/>
+            </w:tcMar>
+          </w:tcPr>
+          <w:p>
+            <w:pPr>
+              <w:spacing w:line="240"/>
+            </w:pPr>
+            <w:r>
+              <w:rPr>
+                <w:rFonts w:ascii="Times New Roman" w:cs="Times New Roman" w:eastAsia="Times New Roman" w:hAnsi="Times New Roman"/>
+                <w:color w:val="000000"/>
+                <w:sz w:val="24"/>
+                <w:szCs w:val="24"/>
+              </w:rPr>
+              <w:t xml:space="preserve">Flat-file persistence, context assembly for LLM</w:t>
+            </w:r>
+          </w:p>
+        </w:tc>
+      </w:tr>
+      <w:tr>
+        <w:tc>
+          <w:tcPr>
+            <w:tcW w:type="dxa" w:w="2000"/>
+            <w:tcBorders>
+              <w:top w:val="single" w:color="000000" w:sz="1"/>
+              <w:left w:val="single" w:color="000000" w:sz="1"/>
+              <w:bottom w:val="single" w:color="000000" w:sz="1"/>
+              <w:right w:val="single" w:color="000000" w:sz="1"/>
+            </w:tcBorders>
+            <w:tcMar>
+              <w:top w:type="dxa" w:w="40"/>
+              <w:left w:type="dxa" w:w="80"/>
+              <w:bottom w:type="dxa" w:w="40"/>
+              <w:right w:type="dxa" w:w="80"/>
+            </w:tcMar>
+          </w:tcPr>
+          <w:p>
+            <w:pPr>
+              <w:spacing w:line="240"/>
+            </w:pPr>
+            <w:r>
+              <w:rPr>
+                <w:rFonts w:ascii="Times New Roman" w:cs="Times New Roman" w:eastAsia="Times New Roman" w:hAnsi="Times New Roman"/>
+                <w:color w:val="000000"/>
+                <w:sz w:val="24"/>
+                <w:szCs w:val="24"/>
+              </w:rPr>
+              <w:t xml:space="preserve">Tools (x4)</w:t>
+            </w:r>
+          </w:p>
+        </w:tc>
+        <w:tc>
+          <w:tcPr>
+            <w:tcW w:type="dxa" w:w="3526"/>
+            <w:tcBorders>
+              <w:top w:val="single" w:color="000000" w:sz="1"/>
+              <w:left w:val="single" w:color="000000" w:sz="1"/>
+              <w:bottom w:val="single" w:color="000000" w:sz="1"/>
+              <w:right w:val="single" w:color="000000" w:sz="1"/>
+            </w:tcBorders>
+            <w:tcMar>
+              <w:top w:type="dxa" w:w="40"/>
+              <w:left w:type="dxa" w:w="80"/>
+              <w:bottom w:type="dxa" w:w="40"/>
+              <w:right w:type="dxa" w:w="80"/>
+            </w:tcMar>
+          </w:tcPr>
+          <w:p>
+            <w:pPr>
+              <w:spacing w:line="240"/>
+            </w:pPr>
+            <w:r>
+              <w:rPr>
+                <w:rFonts w:ascii="Times New Roman" w:cs="Times New Roman" w:eastAsia="Times New Roman" w:hAnsi="Times New Roman"/>
+                <w:color w:val="000000"/>
+                <w:sz w:val="24"/>
+                <w:szCs w:val="24"/>
+              </w:rPr>
+              <w:t xml:space="preserve">file-ops.ts, todo-tool.ts, notes-tool.ts, time-tool.ts</w:t>
+            </w:r>
+          </w:p>
+        </w:tc>
+        <w:tc>
+          <w:tcPr>
+            <w:tcW w:type="dxa" w:w="3500"/>
+            <w:tcBorders>
+              <w:top w:val="single" w:color="000000" w:sz="1"/>
+              <w:left w:val="single" w:color="000000" w:sz="1"/>
+              <w:bottom w:val="single" w:color="000000" w:sz="1"/>
+              <w:right w:val="single" w:color="000000" w:sz="1"/>
+            </w:tcBorders>
+            <w:tcMar>
+              <w:top w:type="dxa" w:w="40"/>
+              <w:left w:type="dxa" w:w="80"/>
+              <w:bottom w:type="dxa" w:w="40"/>
+              <w:right w:type="dxa" w:w="80"/>
+            </w:tcMar>
+          </w:tcPr>
+          <w:p>
+            <w:pPr>
+              <w:spacing w:line="240"/>
+            </w:pPr>
+            <w:r>
+              <w:rPr>
+                <w:rFonts w:ascii="Times New Roman" w:cs="Times New Roman" w:eastAsia="Times New Roman" w:hAnsi="Times New Roman"/>
+                <w:color w:val="000000"/>
+                <w:sz w:val="24"/>
+                <w:szCs w:val="24"/>
+              </w:rPr>
+              <w:t xml:space="preserve">Local-only tool execution with Zod validation</w:t>
+            </w:r>
+          </w:p>
+        </w:tc>
+      </w:tr>
+      <w:tr>
+        <w:tc>
+          <w:tcPr>
+            <w:tcW w:type="dxa" w:w="2000"/>
+            <w:tcBorders>
+              <w:top w:val="single" w:color="000000" w:sz="1"/>
+              <w:left w:val="single" w:color="000000" w:sz="1"/>
+              <w:bottom w:val="single" w:color="000000" w:sz="1"/>
+              <w:right w:val="single" w:color="000000" w:sz="1"/>
+            </w:tcBorders>
+            <w:tcMar>
+              <w:top w:type="dxa" w:w="40"/>
+              <w:left w:type="dxa" w:w="80"/>
+              <w:bottom w:type="dxa" w:w="40"/>
+              <w:right w:type="dxa" w:w="80"/>
+            </w:tcMar>
+          </w:tcPr>
+          <w:p>
+            <w:pPr>
+              <w:spacing w:line="240"/>
+            </w:pPr>
+            <w:r>
+              <w:rPr>
+                <w:rFonts w:ascii="Times New Roman" w:cs="Times New Roman" w:eastAsia="Times New Roman" w:hAnsi="Times New Roman"/>
+                <w:color w:val="000000"/>
+                <w:sz w:val="24"/>
+                <w:szCs w:val="24"/>
+              </w:rPr>
+              <w:t xml:space="preserve">WhatsApp</w:t>
+            </w:r>
+          </w:p>
+        </w:tc>
+        <w:tc>
+          <w:tcPr>
+            <w:tcW w:type="dxa" w:w="3526"/>
+            <w:tcBorders>
+              <w:top w:val="single" w:color="000000" w:sz="1"/>
+              <w:left w:val="single" w:color="000000" w:sz="1"/>
+              <w:bottom w:val="single" w:color="000000" w:sz="1"/>
+              <w:right w:val="single" w:color="000000" w:sz="1"/>
+            </w:tcBorders>
+            <w:tcMar>
+              <w:top w:type="dxa" w:w="40"/>
+              <w:left w:type="dxa" w:w="80"/>
+              <w:bottom w:type="dxa" w:w="40"/>
+              <w:right w:type="dxa" w:w="80"/>
+            </w:tcMar>
+          </w:tcPr>
+          <w:p>
+            <w:pPr>
+              <w:spacing w:line="240"/>
+            </w:pPr>
+            <w:r>
+              <w:rPr>
+                <w:rFonts w:ascii="Times New Roman" w:cs="Times New Roman" w:eastAsia="Times New Roman" w:hAnsi="Times New Roman"/>
+                <w:color w:val="000000"/>
+                <w:sz w:val="24"/>
+                <w:szCs w:val="24"/>
+              </w:rPr>
+              <w:t xml:space="preserve">whatsapp.ts</w:t>
+            </w:r>
+          </w:p>
+        </w:tc>
+        <w:tc>
+          <w:tcPr>
+            <w:tcW w:type="dxa" w:w="3500"/>
+            <w:tcBorders>
+              <w:top w:val="single" w:color="000000" w:sz="1"/>
+              <w:left w:val="single" w:color="000000" w:sz="1"/>
+              <w:bottom w:val="single" w:color="000000" w:sz="1"/>
+              <w:right w:val="single" w:color="000000" w:sz="1"/>
+            </w:tcBorders>
+            <w:tcMar>
+              <w:top w:type="dxa" w:w="40"/>
+              <w:left w:type="dxa" w:w="80"/>
+              <w:bottom w:type="dxa" w:w="40"/>
+              <w:right w:type="dxa" w:w="80"/>
+            </w:tcMar>
+          </w:tcPr>
+          <w:p>
+            <w:pPr>
+              <w:spacing w:line="240"/>
+            </w:pPr>
+            <w:r>
+              <w:rPr>
+                <w:rFonts w:ascii="Times New Roman" w:cs="Times New Roman" w:eastAsia="Times New Roman" w:hAnsi="Times New Roman"/>
+                <w:color w:val="000000"/>
+                <w:sz w:val="24"/>
+                <w:szCs w:val="24"/>
+              </w:rPr>
+              <w:t xml:space="preserve">Baileys multi-device, QR auth, allowlist</w:t>
+            </w:r>
+          </w:p>
+        </w:tc>
+      </w:tr>
+      <w:tr>
+        <w:tc>
+          <w:tcPr>
+            <w:tcW w:type="dxa" w:w="2000"/>
+            <w:tcBorders>
+              <w:top w:val="single" w:color="000000" w:sz="1"/>
+              <w:left w:val="single" w:color="000000" w:sz="1"/>
+              <w:bottom w:val="single" w:color="000000" w:sz="1"/>
+              <w:right w:val="single" w:color="000000" w:sz="1"/>
+            </w:tcBorders>
+            <w:tcMar>
+              <w:top w:type="dxa" w:w="40"/>
+              <w:left w:type="dxa" w:w="80"/>
+              <w:bottom w:type="dxa" w:w="40"/>
+              <w:right w:type="dxa" w:w="80"/>
+            </w:tcMar>
+          </w:tcPr>
+          <w:p>
+            <w:pPr>
+              <w:spacing w:line="240"/>
+            </w:pPr>
+            <w:r>
+              <w:rPr>
+                <w:rFonts w:ascii="Times New Roman" w:cs="Times New Roman" w:eastAsia="Times New Roman" w:hAnsi="Times New Roman"/>
+                <w:color w:val="000000"/>
+                <w:sz w:val="24"/>
+                <w:szCs w:val="24"/>
+              </w:rPr>
+              <w:t xml:space="preserve">Scheduler</w:t>
+            </w:r>
+          </w:p>
+        </w:tc>
+        <w:tc>
+          <w:tcPr>
+            <w:tcW w:type="dxa" w:w="3526"/>
+            <w:tcBorders>
+              <w:top w:val="single" w:color="000000" w:sz="1"/>
+              <w:left w:val="single" w:color="000000" w:sz="1"/>
+              <w:bottom w:val="single" w:color="000000" w:sz="1"/>
+              <w:right w:val="single" w:color="000000" w:sz="1"/>
+            </w:tcBorders>
+            <w:tcMar>
+              <w:top w:type="dxa" w:w="40"/>
+              <w:left w:type="dxa" w:w="80"/>
+              <w:bottom w:type="dxa" w:w="40"/>
+              <w:right w:type="dxa" w:w="80"/>
+            </w:tcMar>
+          </w:tcPr>
+          <w:p>
+            <w:pPr>
+              <w:spacing w:line="240"/>
+            </w:pPr>
+            <w:r>
+              <w:rPr>
+                <w:rFonts w:ascii="Times New Roman" w:cs="Times New Roman" w:eastAsia="Times New Roman" w:hAnsi="Times New Roman"/>
+                <w:color w:val="000000"/>
+                <w:sz w:val="24"/>
+                <w:szCs w:val="24"/>
+              </w:rPr>
+              <w:t xml:space="preserve">scheduler.ts</w:t>
+            </w:r>
+          </w:p>
+        </w:tc>
+        <w:tc>
+          <w:tcPr>
+            <w:tcW w:type="dxa" w:w="3500"/>
+            <w:tcBorders>
+              <w:top w:val="single" w:color="000000" w:sz="1"/>
+              <w:left w:val="single" w:color="000000" w:sz="1"/>
+              <w:bottom w:val="single" w:color="000000" w:sz="1"/>
+              <w:right w:val="single" w:color="000000" w:sz="1"/>
+            </w:tcBorders>
+            <w:tcMar>
+              <w:top w:type="dxa" w:w="40"/>
+              <w:left w:type="dxa" w:w="80"/>
+              <w:bottom w:type="dxa" w:w="40"/>
+              <w:right w:type="dxa" w:w="80"/>
+            </w:tcMar>
+          </w:tcPr>
+          <w:p>
+            <w:pPr>
+              <w:spacing w:line="240"/>
+            </w:pPr>
+            <w:r>
+              <w:rPr>
+                <w:rFonts w:ascii="Times New Roman" w:cs="Times New Roman" w:eastAsia="Times New Roman" w:hAnsi="Times New Roman"/>
+                <w:color w:val="000000"/>
+                <w:sz w:val="24"/>
+                <w:szCs w:val="24"/>
+              </w:rPr>
+              <w:t xml:space="preserve">Cron-based job execution, dynamic reload</w:t>
+            </w:r>
+          </w:p>
+        </w:tc>
+      </w:tr>
+      <w:tr>
+        <w:tc>
+          <w:tcPr>
+            <w:tcW w:type="dxa" w:w="2000"/>
+            <w:tcBorders>
+              <w:top w:val="single" w:color="000000" w:sz="1"/>
+              <w:left w:val="single" w:color="000000" w:sz="1"/>
+              <w:bottom w:val="single" w:color="000000" w:sz="1"/>
+              <w:right w:val="single" w:color="000000" w:sz="1"/>
+            </w:tcBorders>
+            <w:tcMar>
+              <w:top w:type="dxa" w:w="40"/>
+              <w:left w:type="dxa" w:w="80"/>
+              <w:bottom w:type="dxa" w:w="40"/>
+              <w:right w:type="dxa" w:w="80"/>
+            </w:tcMar>
+          </w:tcPr>
+          <w:p>
+            <w:pPr>
+              <w:spacing w:line="240"/>
+            </w:pPr>
+            <w:r>
+              <w:rPr>
+                <w:rFonts w:ascii="Times New Roman" w:cs="Times New Roman" w:eastAsia="Times New Roman" w:hAnsi="Times New Roman"/>
+                <w:color w:val="000000"/>
+                <w:sz w:val="24"/>
+                <w:szCs w:val="24"/>
+              </w:rPr>
+              <w:t xml:space="preserve">Audit</w:t>
+            </w:r>
+          </w:p>
+        </w:tc>
+        <w:tc>
+          <w:tcPr>
+            <w:tcW w:type="dxa" w:w="3526"/>
+            <w:tcBorders>
+              <w:top w:val="single" w:color="000000" w:sz="1"/>
+              <w:left w:val="single" w:color="000000" w:sz="1"/>
+              <w:bottom w:val="single" w:color="000000" w:sz="1"/>
+              <w:right w:val="single" w:color="000000" w:sz="1"/>
+            </w:tcBorders>
+            <w:tcMar>
+              <w:top w:type="dxa" w:w="40"/>
+              <w:left w:type="dxa" w:w="80"/>
+              <w:bottom w:type="dxa" w:w="40"/>
+              <w:right w:type="dxa" w:w="80"/>
+            </w:tcMar>
+          </w:tcPr>
+          <w:p>
+            <w:pPr>
+              <w:spacing w:line="240"/>
+            </w:pPr>
+            <w:r>
+              <w:rPr>
+                <w:rFonts w:ascii="Times New Roman" w:cs="Times New Roman" w:eastAsia="Times New Roman" w:hAnsi="Times New Roman"/>
+                <w:color w:val="000000"/>
+                <w:sz w:val="24"/>
+                <w:szCs w:val="24"/>
+              </w:rPr>
+              <w:t xml:space="preserve">audit.ts</w:t>
+            </w:r>
+          </w:p>
+        </w:tc>
+        <w:tc>
+          <w:tcPr>
+            <w:tcW w:type="dxa" w:w="3500"/>
+            <w:tcBorders>
+              <w:top w:val="single" w:color="000000" w:sz="1"/>
+              <w:left w:val="single" w:color="000000" w:sz="1"/>
+              <w:bottom w:val="single" w:color="000000" w:sz="1"/>
+              <w:right w:val="single" w:color="000000" w:sz="1"/>
+            </w:tcBorders>
+            <w:tcMar>
+              <w:top w:type="dxa" w:w="40"/>
+              <w:left w:type="dxa" w:w="80"/>
+              <w:bottom w:type="dxa" w:w="40"/>
+              <w:right w:type="dxa" w:w="80"/>
+            </w:tcMar>
+          </w:tcPr>
+          <w:p>
+            <w:pPr>
+              <w:spacing w:line="240"/>
+            </w:pPr>
+            <w:r>
+              <w:rPr>
+                <w:rFonts w:ascii="Times New Roman" w:cs="Times New Roman" w:eastAsia="Times New Roman" w:hAnsi="Times New Roman"/>
+                <w:color w:val="000000"/>
+                <w:sz w:val="24"/>
+                <w:szCs w:val="24"/>
+              </w:rPr>
+              <w:t xml:space="preserve">Append-only action logging</w:t>
+            </w:r>
+          </w:p>
+        </w:tc>
+      </w:tr>
+    </w:tbl>
+    <w:p>
+      <w:pPr>
+        <w:spacing w:after="120" w:before="120" w:line="240"/>
+        <w:jc w:val="center"/>
+      </w:pPr>
+      <w:r>
+        <w:rPr>
+          <w:rFonts w:ascii="Times New Roman" w:cs="Times New Roman" w:eastAsia="Times New Roman" w:hAnsi="Times New Roman"/>
+          <w:i/>
+          <w:iCs/>
+          <w:color w:val="000000"/>
+          <w:sz w:val="24"/>
+          <w:szCs w:val="24"/>
+        </w:rPr>
+        <w:t xml:space="preserve">[Figure 2: Architecture diagram — WhatsApp → Channel Adapter → Agent Core → AuthZ → Tool → Response — to be inserted]</w:t>
+      </w:r>
+    </w:p>
+    <w:p>
+      <w:pPr>
+        <w:spacing w:after="120" w:before="240" w:line="240"/>
+        <w:jc w:val="left"/>
+      </w:pPr>
+      <w:r>
+        <w:rPr>
+          <w:rFonts w:ascii="Times New Roman" w:cs="Times New Roman" w:eastAsia="Times New Roman" w:hAnsi="Times New Roman"/>
+          <w:b/>
+          <w:bCs/>
+          <w:color w:val="000000"/>
+          <w:sz w:val="28"/>
+          <w:szCs w:val="28"/>
+        </w:rPr>
+        <w:t xml:space="preserve">3.2 Single-Decision Model</w:t>
+      </w:r>
+    </w:p>
+    <w:p>
+      <w:pPr>
+        <w:spacing w:after="120" w:line="240"/>
+      </w:pPr>
+      <w:r>
+        <w:rPr>
+          <w:rFonts w:ascii="Times New Roman" w:cs="Times New Roman" w:eastAsia="Times New Roman" w:hAnsi="Times New Roman"/>
+          <w:color w:val="000000"/>
+          <w:sz w:val="24"/>
+          <w:szCs w:val="24"/>
+        </w:rPr>
+        <w:t xml:space="preserve">The most distinctive design choice in LiteClaw is the single-decision-per-turn model. Rather than allowing the LLM to iteratively reason and act across multiple turns, each user message produces exactly one LLM call that returns exactly one decision. The LLM must choose between three mutually exclusive actions, encoded as a JSON discriminated union validated by Zod schemas:</w:t>
+      </w:r>
+    </w:p>
+    <w:p>
+      <w:pPr>
+        <w:spacing w:after="120" w:line="240"/>
+      </w:pPr>
+      <w:r>
+        <w:rPr>
+          <w:rFonts w:ascii="Times New Roman" w:cs="Times New Roman" w:eastAsia="Times New Roman" w:hAnsi="Times New Roman"/>
+          <w:b/>
+          <w:bCs/>
+          <w:color w:val="000000"/>
+          <w:sz w:val="24"/>
+          <w:szCs w:val="24"/>
+        </w:rPr>
+        <w:t xml:space="preserve">Reply: </w:t>
+      </w:r>
+      <w:r>
+        <w:rPr>
+          <w:rFonts w:ascii="Times New Roman" w:cs="Times New Roman" w:eastAsia="Times New Roman" w:hAnsi="Times New Roman"/>
+          <w:color w:val="000000"/>
+          <w:sz w:val="24"/>
+          <w:szCs w:val="24"/>
+        </w:rPr>
+        <w:t xml:space="preserve">{"type": "reply", "text": "..."} — A direct text response sent to the user via WhatsApp.</w:t>
+      </w:r>
+    </w:p>
+    <w:p>
+      <w:pPr>
+        <w:spacing w:after="120" w:line="240"/>
+      </w:pPr>
+      <w:r>
+        <w:rPr>
+          <w:rFonts w:ascii="Times New Roman" w:cs="Times New Roman" w:eastAsia="Times New Roman" w:hAnsi="Times New Roman"/>
+          <w:b/>
+          <w:bCs/>
+          <w:color w:val="000000"/>
+          <w:sz w:val="24"/>
+          <w:szCs w:val="24"/>
+        </w:rPr>
+        <w:t xml:space="preserve">Tool Call: </w:t>
+      </w:r>
+      <w:r>
+        <w:rPr>
+          <w:rFonts w:ascii="Times New Roman" w:cs="Times New Roman" w:eastAsia="Times New Roman" w:hAnsi="Times New Roman"/>
+          <w:color w:val="000000"/>
+          <w:sz w:val="24"/>
+          <w:szCs w:val="24"/>
+        </w:rPr>
+        <w:t xml:space="preserve">{"type": "tool_call", "tool": "...", "args": {...}} — Execute a single local tool and return the result.</w:t>
+      </w:r>
+    </w:p>
+    <w:p>
+      <w:pPr>
+        <w:spacing w:after="120" w:line="240"/>
+      </w:pPr>
+      <w:r>
+        <w:rPr>
+          <w:rFonts w:ascii="Times New Roman" w:cs="Times New Roman" w:eastAsia="Times New Roman" w:hAnsi="Times New Roman"/>
+          <w:b/>
+          <w:bCs/>
+          <w:color w:val="000000"/>
+          <w:sz w:val="24"/>
+          <w:szCs w:val="24"/>
+        </w:rPr>
+        <w:t xml:space="preserve">Schedule: </w:t>
+      </w:r>
+      <w:r>
+        <w:rPr>
+          <w:rFonts w:ascii="Times New Roman" w:cs="Times New Roman" w:eastAsia="Times New Roman" w:hAnsi="Times New Roman"/>
+          <w:color w:val="000000"/>
+          <w:sz w:val="24"/>
+          <w:szCs w:val="24"/>
+        </w:rPr>
+        <w:t xml:space="preserve">{"type": "schedule", "job": {"name": "...", "prompt": "...", "cron": "..."}} — Create or modify a scheduled reminder delivered via WhatsApp.</w:t>
+      </w:r>
+    </w:p>
+    <w:p>
+      <w:pPr>
+        <w:spacing w:after="120" w:line="240"/>
+      </w:pPr>
+      <w:r>
+        <w:rPr>
+          <w:rFonts w:ascii="Times New Roman" w:cs="Times New Roman" w:eastAsia="Times New Roman" w:hAnsi="Times New Roman"/>
+          <w:color w:val="000000"/>
+          <w:sz w:val="24"/>
+          <w:szCs w:val="24"/>
+        </w:rPr>
+        <w:t xml:space="preserve">This constraint yields three critical benefits. First, predictability: every user message maps to at most one tool execution, making system behavior deterministic and easy to reason about. Second, auditability: the append-only audit log captures every decision, enabling complete reconstruction of agent behavior. Third, bounded resource consumption: execution time and cost are strictly proportional to the number of user messages, with no risk of runaway tool chains.</w:t>
+      </w:r>
+    </w:p>
+    <w:p>
+      <w:pPr>
+        <w:spacing w:after="120" w:line="240"/>
+      </w:pPr>
+      <w:r>
+        <w:rPr>
+          <w:rFonts w:ascii="Times New Roman" w:cs="Times New Roman" w:eastAsia="Times New Roman" w:hAnsi="Times New Roman"/>
+          <w:color w:val="000000"/>
+          <w:sz w:val="24"/>
+          <w:szCs w:val="24"/>
+        </w:rPr>
+        <w:t xml:space="preserve">When the LLM produces output that does not parse as valid JSON or fails Zod schema validation, the DecisionParseError handler generates a safe fallback reply informing the user of the error, rather than silently failing or retrying.</w:t>
+      </w:r>
+    </w:p>
+    <w:p>
+      <w:pPr>
+        <w:spacing w:after="120" w:before="240" w:line="240"/>
+        <w:jc w:val="left"/>
+      </w:pPr>
+      <w:r>
+        <w:rPr>
+          <w:rFonts w:ascii="Times New Roman" w:cs="Times New Roman" w:eastAsia="Times New Roman" w:hAnsi="Times New Roman"/>
+          <w:b/>
+          <w:bCs/>
+          <w:color w:val="000000"/>
+          <w:sz w:val="28"/>
+          <w:szCs w:val="28"/>
+        </w:rPr>
+        <w:t xml:space="preserve">3.3 Multi-Provider LLM Integration</w:t>
+      </w:r>
+    </w:p>
+    <w:p>
+      <w:pPr>
+        <w:spacing w:after="120" w:line="240"/>
+      </w:pPr>
+      <w:r>
+        <w:rPr>
+          <w:rFonts w:ascii="Times New Roman" w:cs="Times New Roman" w:eastAsia="Times New Roman" w:hAnsi="Times New Roman"/>
+          <w:color w:val="000000"/>
+          <w:sz w:val="24"/>
+          <w:szCs w:val="24"/>
+        </w:rPr>
+        <w:t xml:space="preserve">LiteClaw employs the adapter pattern to support three LLM providers through a unified LLMClient interface with a single chat(systemPrompt, messages) method that returns raw JSON text. Critically, the system does not use any provider’s native tool-calling API; instead, available tools are described within the system prompt text, and the LLM is instructed to output structured JSON. This approach works uniformly across all providers and enables the use of JSON response mode where available. Table 2 summarizes the supported providers.</w:t>
+      </w:r>
+    </w:p>
+    <w:p>
+      <w:pPr>
+        <w:spacing w:after="120" w:line="240"/>
+        <w:jc w:val="center"/>
+      </w:pPr>
+      <w:r>
+        <w:rPr>
+          <w:rFonts w:ascii="Times New Roman" w:cs="Times New Roman" w:eastAsia="Times New Roman" w:hAnsi="Times New Roman"/>
+          <w:b/>
+          <w:bCs/>
+          <w:i/>
+          <w:iCs/>
+          <w:color w:val="000000"/>
+          <w:sz w:val="24"/>
+          <w:szCs w:val="24"/>
+        </w:rPr>
+        <w:t xml:space="preserve">Table 2: Supported LLM Providers</w:t>
       </w:r>
     </w:p>
     <w:tbl>
@@ -670,8 +1749,8 @@
       </w:tblPr>
       <w:tblGrid>
         <w:gridCol w:w="2256"/>
-        <w:gridCol w:w="2256"/>
-        <w:gridCol w:w="2758"/>
+        <w:gridCol w:w="1500"/>
+        <w:gridCol w:w="3514"/>
         <w:gridCol w:w="1756"/>
       </w:tblGrid>
       <w:tr>
@@ -711,7 +1790,7 @@
         </w:tc>
         <w:tc>
           <w:tcPr>
-            <w:tcW w:type="dxa" w:w="2256"/>
+            <w:tcW w:type="dxa" w:w="1500"/>
             <w:tcBorders>
               <w:top w:val="single" w:color="000000" w:sz="1"/>
               <w:left w:val="single" w:color="000000" w:sz="1"/>
@@ -745,7 +1824,7 @@
         </w:tc>
         <w:tc>
           <w:tcPr>
-            <w:tcW w:type="dxa" w:w="2758"/>
+            <w:tcW w:type="dxa" w:w="3514"/>
             <w:tcBorders>
               <w:top w:val="single" w:color="000000" w:sz="1"/>
               <w:left w:val="single" w:color="000000" w:sz="1"/>
@@ -846,7 +1925,7 @@
         </w:tc>
         <w:tc>
           <w:tcPr>
-            <w:tcW w:type="dxa" w:w="2256"/>
+            <w:tcW w:type="dxa" w:w="1500"/>
             <w:tcBorders>
               <w:top w:val="single" w:color="000000" w:sz="1"/>
               <w:left w:val="single" w:color="000000" w:sz="1"/>
@@ -877,7 +1956,7 @@
         </w:tc>
         <w:tc>
           <w:tcPr>
-            <w:tcW w:type="dxa" w:w="2758"/>
+            <w:tcW w:type="dxa" w:w="3514"/>
             <w:tcBorders>
               <w:top w:val="single" w:color="000000" w:sz="1"/>
               <w:left w:val="single" w:color="000000" w:sz="1"/>
@@ -933,7 +2012,7 @@
                 <w:sz w:val="24"/>
                 <w:szCs w:val="24"/>
               </w:rPr>
-              <w:t xml:space="preserve">OpenAI</w:t>
+              <w:t xml:space="preserve">OpenAI-compat</w:t>
             </w:r>
           </w:p>
         </w:tc>
@@ -972,7 +2051,7 @@
         </w:tc>
         <w:tc>
           <w:tcPr>
-            <w:tcW w:type="dxa" w:w="2256"/>
+            <w:tcW w:type="dxa" w:w="1500"/>
             <w:tcBorders>
               <w:top w:val="single" w:color="000000" w:sz="1"/>
               <w:left w:val="single" w:color="000000" w:sz="1"/>
@@ -1003,7 +2082,7 @@
         </w:tc>
         <w:tc>
           <w:tcPr>
-            <w:tcW w:type="dxa" w:w="2758"/>
+            <w:tcW w:type="dxa" w:w="3514"/>
             <w:tcBorders>
               <w:top w:val="single" w:color="000000" w:sz="1"/>
               <w:left w:val="single" w:color="000000" w:sz="1"/>
@@ -1059,7 +2138,7 @@
                 <w:sz w:val="24"/>
                 <w:szCs w:val="24"/>
               </w:rPr>
-              <w:t xml:space="preserve">OpenAI</w:t>
+              <w:t xml:space="preserve">OpenAI-compat</w:t>
             </w:r>
           </w:p>
         </w:tc>
@@ -1092,13 +2171,13 @@
                 <w:sz w:val="24"/>
                 <w:szCs w:val="24"/>
               </w:rPr>
-              <w:t xml:space="preserve">DeepSeek</w:t>
-            </w:r>
-          </w:p>
-        </w:tc>
-        <w:tc>
-          <w:tcPr>
-            <w:tcW w:type="dxa" w:w="2256"/>
+              <w:t xml:space="preserve">Anthropic</w:t>
+            </w:r>
+          </w:p>
+        </w:tc>
+        <w:tc>
+          <w:tcPr>
+            <w:tcW w:type="dxa" w:w="1500"/>
             <w:tcBorders>
               <w:top w:val="single" w:color="000000" w:sz="1"/>
               <w:left w:val="single" w:color="000000" w:sz="1"/>
@@ -1129,32 +2208,32 @@
         </w:tc>
         <w:tc>
           <w:tcPr>
-            <w:tcW w:type="dxa" w:w="2758"/>
-            <w:tcBorders>
-              <w:top w:val="single" w:color="000000" w:sz="1"/>
-              <w:left w:val="single" w:color="000000" w:sz="1"/>
-              <w:bottom w:val="single" w:color="000000" w:sz="1"/>
-              <w:right w:val="single" w:color="000000" w:sz="1"/>
-            </w:tcBorders>
-            <w:tcMar>
-              <w:top w:type="dxa" w:w="40"/>
-              <w:left w:type="dxa" w:w="80"/>
-              <w:bottom w:type="dxa" w:w="40"/>
-              <w:right w:type="dxa" w:w="80"/>
-            </w:tcMar>
-          </w:tcPr>
-          <w:p>
-            <w:pPr>
-              <w:spacing w:line="240"/>
-            </w:pPr>
-            <w:r>
-              <w:rPr>
-                <w:rFonts w:ascii="Times New Roman" w:cs="Times New Roman" w:eastAsia="Times New Roman" w:hAnsi="Times New Roman"/>
-                <w:color w:val="000000"/>
-                <w:sz w:val="24"/>
-                <w:szCs w:val="24"/>
-              </w:rPr>
-              <w:t xml:space="preserve">deepseek-chat</w:t>
+            <w:tcW w:type="dxa" w:w="3514"/>
+            <w:tcBorders>
+              <w:top w:val="single" w:color="000000" w:sz="1"/>
+              <w:left w:val="single" w:color="000000" w:sz="1"/>
+              <w:bottom w:val="single" w:color="000000" w:sz="1"/>
+              <w:right w:val="single" w:color="000000" w:sz="1"/>
+            </w:tcBorders>
+            <w:tcMar>
+              <w:top w:type="dxa" w:w="40"/>
+              <w:left w:type="dxa" w:w="80"/>
+              <w:bottom w:type="dxa" w:w="40"/>
+              <w:right w:type="dxa" w:w="80"/>
+            </w:tcMar>
+          </w:tcPr>
+          <w:p>
+            <w:pPr>
+              <w:spacing w:line="240"/>
+            </w:pPr>
+            <w:r>
+              <w:rPr>
+                <w:rFonts w:ascii="Times New Roman" w:cs="Times New Roman" w:eastAsia="Times New Roman" w:hAnsi="Times New Roman"/>
+                <w:color w:val="000000"/>
+                <w:sz w:val="24"/>
+                <w:szCs w:val="24"/>
+              </w:rPr>
+              <w:t xml:space="preserve">claude-sonnet-4-20250514</w:t>
             </w:r>
           </w:p>
         </w:tc>
@@ -1185,133 +2264,7 @@
                 <w:sz w:val="24"/>
                 <w:szCs w:val="24"/>
               </w:rPr>
-              <w:t xml:space="preserve">OpenAI</w:t>
-            </w:r>
-          </w:p>
-        </w:tc>
-      </w:tr>
-      <w:tr>
-        <w:tc>
-          <w:tcPr>
-            <w:tcW w:type="dxa" w:w="2256"/>
-            <w:tcBorders>
-              <w:top w:val="single" w:color="000000" w:sz="1"/>
-              <w:left w:val="single" w:color="000000" w:sz="1"/>
-              <w:bottom w:val="single" w:color="000000" w:sz="1"/>
-              <w:right w:val="single" w:color="000000" w:sz="1"/>
-            </w:tcBorders>
-            <w:tcMar>
-              <w:top w:type="dxa" w:w="40"/>
-              <w:left w:type="dxa" w:w="80"/>
-              <w:bottom w:type="dxa" w:w="40"/>
-              <w:right w:type="dxa" w:w="80"/>
-            </w:tcMar>
-          </w:tcPr>
-          <w:p>
-            <w:pPr>
-              <w:spacing w:line="240"/>
-            </w:pPr>
-            <w:r>
-              <w:rPr>
-                <w:rFonts w:ascii="Times New Roman" w:cs="Times New Roman" w:eastAsia="Times New Roman" w:hAnsi="Times New Roman"/>
-                <w:color w:val="000000"/>
-                <w:sz w:val="24"/>
-                <w:szCs w:val="24"/>
-              </w:rPr>
-              <w:t xml:space="preserve">Anthropic</w:t>
-            </w:r>
-          </w:p>
-        </w:tc>
-        <w:tc>
-          <w:tcPr>
-            <w:tcW w:type="dxa" w:w="2256"/>
-            <w:tcBorders>
-              <w:top w:val="single" w:color="000000" w:sz="1"/>
-              <w:left w:val="single" w:color="000000" w:sz="1"/>
-              <w:bottom w:val="single" w:color="000000" w:sz="1"/>
-              <w:right w:val="single" w:color="000000" w:sz="1"/>
-            </w:tcBorders>
-            <w:tcMar>
-              <w:top w:type="dxa" w:w="40"/>
-              <w:left w:type="dxa" w:w="80"/>
-              <w:bottom w:type="dxa" w:w="40"/>
-              <w:right w:type="dxa" w:w="80"/>
-            </w:tcMar>
-          </w:tcPr>
-          <w:p>
-            <w:pPr>
-              <w:spacing w:line="240"/>
-            </w:pPr>
-            <w:r>
-              <w:rPr>
-                <w:rFonts w:ascii="Times New Roman" w:cs="Times New Roman" w:eastAsia="Times New Roman" w:hAnsi="Times New Roman"/>
-                <w:color w:val="000000"/>
-                <w:sz w:val="24"/>
-                <w:szCs w:val="24"/>
-              </w:rPr>
-              <w:t xml:space="preserve">Paid</w:t>
-            </w:r>
-          </w:p>
-        </w:tc>
-        <w:tc>
-          <w:tcPr>
-            <w:tcW w:type="dxa" w:w="2758"/>
-            <w:tcBorders>
-              <w:top w:val="single" w:color="000000" w:sz="1"/>
-              <w:left w:val="single" w:color="000000" w:sz="1"/>
-              <w:bottom w:val="single" w:color="000000" w:sz="1"/>
-              <w:right w:val="single" w:color="000000" w:sz="1"/>
-            </w:tcBorders>
-            <w:tcMar>
-              <w:top w:type="dxa" w:w="40"/>
-              <w:left w:type="dxa" w:w="80"/>
-              <w:bottom w:type="dxa" w:w="40"/>
-              <w:right w:type="dxa" w:w="80"/>
-            </w:tcMar>
-          </w:tcPr>
-          <w:p>
-            <w:pPr>
-              <w:spacing w:line="240"/>
-            </w:pPr>
-            <w:r>
-              <w:rPr>
-                <w:rFonts w:ascii="Times New Roman" w:cs="Times New Roman" w:eastAsia="Times New Roman" w:hAnsi="Times New Roman"/>
-                <w:color w:val="000000"/>
-                <w:sz w:val="24"/>
-                <w:szCs w:val="24"/>
-              </w:rPr>
-              <w:t xml:space="preserve">claude-sonnet-4-20250514</w:t>
-            </w:r>
-          </w:p>
-        </w:tc>
-        <w:tc>
-          <w:tcPr>
-            <w:tcW w:type="dxa" w:w="1756"/>
-            <w:tcBorders>
-              <w:top w:val="single" w:color="000000" w:sz="1"/>
-              <w:left w:val="single" w:color="000000" w:sz="1"/>
-              <w:bottom w:val="single" w:color="000000" w:sz="1"/>
-              <w:right w:val="single" w:color="000000" w:sz="1"/>
-            </w:tcBorders>
-            <w:tcMar>
-              <w:top w:type="dxa" w:w="40"/>
-              <w:left w:type="dxa" w:w="80"/>
-              <w:bottom w:type="dxa" w:w="40"/>
-              <w:right w:type="dxa" w:w="80"/>
-            </w:tcMar>
-          </w:tcPr>
-          <w:p>
-            <w:pPr>
-              <w:spacing w:line="240"/>
-            </w:pPr>
-            <w:r>
-              <w:rPr>
-                <w:rFonts w:ascii="Times New Roman" w:cs="Times New Roman" w:eastAsia="Times New Roman" w:hAnsi="Times New Roman"/>
-                <w:color w:val="000000"/>
-                <w:sz w:val="24"/>
-                <w:szCs w:val="24"/>
-              </w:rPr>
-              <w:t xml:space="preserve">Native</w:t>
+              <w:t xml:space="preserve">Native SDK</w:t>
             </w:r>
           </w:p>
         </w:tc>
@@ -1319,6 +2272,51 @@
     </w:tbl>
     <w:p>
       <w:pPr>
+        <w:spacing w:after="120" w:line="240"/>
+      </w:pPr>
+      <w:r>
+        <w:rPr>
+          <w:rFonts w:ascii="Times New Roman" w:cs="Times New Roman" w:eastAsia="Times New Roman" w:hAnsi="Times New Roman"/>
+          <w:color w:val="000000"/>
+          <w:sz w:val="24"/>
+          <w:szCs w:val="24"/>
+        </w:rPr>
+        <w:t xml:space="preserve">The GroqClient and GeminiClient both leverage the OpenAI SDK configured with custom base URLs, taking advantage of these providers’ OpenAI-compatible APIs with JSON mode enabled. The AnthropicClient uses the native Anthropic SDK. A factory function, createLLMClient(), examines the provider configuration and instantiates the appropriate client. Switching providers requires changing a single environment variable.</w:t>
+      </w:r>
+    </w:p>
+    <w:p>
+      <w:pPr>
+        <w:spacing w:after="120" w:before="240" w:line="240"/>
+        <w:jc w:val="left"/>
+      </w:pPr>
+      <w:r>
+        <w:rPr>
+          <w:rFonts w:ascii="Times New Roman" w:cs="Times New Roman" w:eastAsia="Times New Roman" w:hAnsi="Times New Roman"/>
+          <w:b/>
+          <w:bCs/>
+          <w:color w:val="000000"/>
+          <w:sz w:val="28"/>
+          <w:szCs w:val="28"/>
+        </w:rPr>
+        <w:t xml:space="preserve">3.4 Authorization Wall (AuthZ)</w:t>
+      </w:r>
+    </w:p>
+    <w:p>
+      <w:pPr>
+        <w:spacing w:after="120" w:line="240"/>
+      </w:pPr>
+      <w:r>
+        <w:rPr>
+          <w:rFonts w:ascii="Times New Roman" w:cs="Times New Roman" w:eastAsia="Times New Roman" w:hAnsi="Times New Roman"/>
+          <w:color w:val="000000"/>
+          <w:sz w:val="24"/>
+          <w:szCs w:val="24"/>
+        </w:rPr>
+        <w:t xml:space="preserve">LiteClaw introduces a default-deny authorization module that interposes between the decision parser and tool execution. Before any tool is invoked, the AuthZ wall validates: (1) whether the tool category (time, todo, notes, schedule, file_ops) is in the hardcoded allowlist; (2) for file operations, whether the target path resolves within the permitted directories (data/ and notes/ only); and (3) that the tool is not in a permanently forbidden category (network, exec, shell). Any request that fails validation is immediately blocked, and the denial is logged to the audit trail with the reason. This ensures that even if the LLM hallucinates a tool name or attempts to access restricted resources, the system remains secure.</w:t>
+      </w:r>
+    </w:p>
+    <w:p>
+      <w:pPr>
         <w:spacing w:after="120" w:before="240" w:line="240"/>
         <w:jc w:val="center"/>
       </w:pPr>
@@ -1331,7 +2329,7 @@
           <w:sz w:val="32"/>
           <w:szCs w:val="32"/>
         </w:rPr>
-        <w:t xml:space="preserve">4. System Design</w:t>
+        <w:t xml:space="preserve">4. System Design and Prompt Description</w:t>
       </w:r>
     </w:p>
     <w:p>
@@ -1362,107 +2360,7 @@
           <w:sz w:val="24"/>
           <w:szCs w:val="24"/>
         </w:rPr>
-        <w:t xml:space="preserve">The tool system is built on a base Tool class that defines four required properties: a unique name string, a human-readable description, an inputSchema defined using the Zod validation library, and an asynchronous execute() method. The Zod schema serves a dual purpose: it provides runtime input validation and is automatically converted to JSON Schema format for inclusion in LLM tool definitions. The Tool Registry maintains a map of registered tools and provides methods for tool lookup and schema export.</w:t>
-      </w:r>
-    </w:p>
-    <w:p>
-      <w:pPr>
-        <w:spacing w:after="120" w:line="240"/>
-      </w:pPr>
-      <w:r>
-        <w:rPr>
-          <w:rFonts w:ascii="Times New Roman" w:cs="Times New Roman" w:eastAsia="Times New Roman" w:hAnsi="Times New Roman"/>
-          <w:b/>
-          <w:bCs/>
-          <w:color w:val="000000"/>
-          <w:sz w:val="24"/>
-          <w:szCs w:val="24"/>
-        </w:rPr>
-        <w:t xml:space="preserve">ShellTool </w:t>
-      </w:r>
-      <w:r>
-        <w:rPr>
-          <w:rFonts w:ascii="Times New Roman" w:cs="Times New Roman" w:eastAsia="Times New Roman" w:hAnsi="Times New Roman"/>
-          <w:color w:val="000000"/>
-          <w:sz w:val="24"/>
-          <w:szCs w:val="24"/>
-        </w:rPr>
-        <w:t xml:space="preserve">enables the agent to execute arbitrary shell commands via /bin/sh within the configured workspace directory. To mitigate the risk of destructive operations, the tool implements a command denylist that blocks known dangerous patterns including “rm -rf /”, “dd”, “mkfs”, and fork bomb constructs. A configurable timeout (default 15 seconds) prevents long-running processes from blocking the agent loop, and output is capped at 10,000 characters to prevent memory exhaustion from verbose command output.</w:t>
-      </w:r>
-    </w:p>
-    <w:p>
-      <w:pPr>
-        <w:spacing w:after="120" w:line="240"/>
-      </w:pPr>
-      <w:r>
-        <w:rPr>
-          <w:rFonts w:ascii="Times New Roman" w:cs="Times New Roman" w:eastAsia="Times New Roman" w:hAnsi="Times New Roman"/>
-          <w:b/>
-          <w:bCs/>
-          <w:color w:val="000000"/>
-          <w:sz w:val="24"/>
-          <w:szCs w:val="24"/>
-        </w:rPr>
-        <w:t xml:space="preserve">FileOpsTool </w:t>
-      </w:r>
-      <w:r>
-        <w:rPr>
-          <w:rFonts w:ascii="Times New Roman" w:cs="Times New Roman" w:eastAsia="Times New Roman" w:hAnsi="Times New Roman"/>
-          <w:color w:val="000000"/>
-          <w:sz w:val="24"/>
-          <w:szCs w:val="24"/>
-        </w:rPr>
-        <w:t xml:space="preserve">provides five file operations: read, write, append, list, and search. All operations are confined to the configured workspace directory through a resolveSafe() function that resolves the requested path, then validates that the resolved absolute path begins with the workspace directory prefix. This prevents path traversal attacks using sequences such as “../” that could otherwise escape the workspace boundary. Read operations truncate output at 10KB, and the search operation limits results to 20 matches with a maximum directory depth of 5 levels.</w:t>
-      </w:r>
-    </w:p>
-    <w:p>
-      <w:pPr>
-        <w:spacing w:after="120" w:line="240"/>
-      </w:pPr>
-      <w:r>
-        <w:rPr>
-          <w:rFonts w:ascii="Times New Roman" w:cs="Times New Roman" w:eastAsia="Times New Roman" w:hAnsi="Times New Roman"/>
-          <w:b/>
-          <w:bCs/>
-          <w:color w:val="000000"/>
-          <w:sz w:val="24"/>
-          <w:szCs w:val="24"/>
-        </w:rPr>
-        <w:t xml:space="preserve">WebAccessTool </w:t>
-      </w:r>
-      <w:r>
-        <w:rPr>
-          <w:rFonts w:ascii="Times New Roman" w:cs="Times New Roman" w:eastAsia="Times New Roman" w:hAnsi="Times New Roman"/>
-          <w:color w:val="000000"/>
-          <w:sz w:val="24"/>
-          <w:szCs w:val="24"/>
-        </w:rPr>
-        <w:t xml:space="preserve">fetches web pages and API endpoints using the Node.js native fetch() function. For HTML responses, the tool performs automatic text extraction by removing script and style elements, stripping all remaining HTML tags, decoding common HTML entities, and collapsing whitespace. The tool supports both GET and POST methods with custom headers and request bodies. A 15-second timeout and 8KB output cap prevent the agent from being blocked by slow or excessively large responses.</w:t>
-      </w:r>
-    </w:p>
-    <w:p>
-      <w:pPr>
-        <w:spacing w:after="120" w:line="240"/>
-      </w:pPr>
-      <w:r>
-        <w:rPr>
-          <w:rFonts w:ascii="Times New Roman" w:cs="Times New Roman" w:eastAsia="Times New Roman" w:hAnsi="Times New Roman"/>
-          <w:b/>
-          <w:bCs/>
-          <w:color w:val="000000"/>
-          <w:sz w:val="24"/>
-          <w:szCs w:val="24"/>
-        </w:rPr>
-        <w:t xml:space="preserve">MemoryTool </w:t>
-      </w:r>
-      <w:r>
-        <w:rPr>
-          <w:rFonts w:ascii="Times New Roman" w:cs="Times New Roman" w:eastAsia="Times New Roman" w:hAnsi="Times New Roman"/>
-          <w:color w:val="000000"/>
-          <w:sz w:val="24"/>
-          <w:szCs w:val="24"/>
-        </w:rPr>
-        <w:t xml:space="preserve">serves as the LLM’s interface to the persistent Memory Manager. It exposes three operations: store (save a fact with optional tags), recall (search stored facts by keyword), and list_conversations (retrieve metadata for past conversation sessions). Table 2 summarizes the tool system.</w:t>
+        <w:t xml:space="preserve">The tool system is built on a base Tool abstract class that requires four properties: a unique name, a description, an inputSchema defined using the Zod validation library, and an asynchronous execute() method. The Zod schema provides both runtime input validation and automatic conversion to JSON Schema format for inclusion in the system prompt. The Tool Registry manages registration, lookup, and execution with configurable timeouts (default 30 seconds). Table 3 summarizes the four built-in tools.</w:t>
       </w:r>
     </w:p>
     <w:p>
@@ -1481,7 +2379,7 @@
           <w:sz w:val="24"/>
           <w:szCs w:val="24"/>
         </w:rPr>
-        <w:t xml:space="preserve">Table 2: Built-in Tool Summary</w:t>
+        <w:t xml:space="preserve">Table 3: Built-in Tool Summary</w:t>
       </w:r>
     </w:p>
     <w:tbl>
@@ -1633,7 +2531,7 @@
                 <w:sz w:val="24"/>
                 <w:szCs w:val="24"/>
               </w:rPr>
-              <w:t xml:space="preserve">Shell</w:t>
+              <w:t xml:space="preserve">File Ops</w:t>
             </w:r>
           </w:p>
         </w:tc>
@@ -1664,7 +2562,7 @@
                 <w:sz w:val="24"/>
                 <w:szCs w:val="24"/>
               </w:rPr>
-              <w:t xml:space="preserve">Execute shell commands</w:t>
+              <w:t xml:space="preserve">Read, write, append, list</w:t>
             </w:r>
           </w:p>
         </w:tc>
@@ -1695,7 +2593,7 @@
                 <w:sz w:val="24"/>
                 <w:szCs w:val="24"/>
               </w:rPr>
-              <w:t xml:space="preserve">Command denylist, 15s timeout, 10K char cap</w:t>
+              <w:t xml:space="preserve">Path traversal prevention, restricted to data/notes dirs</w:t>
             </w:r>
           </w:p>
         </w:tc>
@@ -1728,7 +2626,7 @@
                 <w:sz w:val="24"/>
                 <w:szCs w:val="24"/>
               </w:rPr>
-              <w:t xml:space="preserve">File Ops</w:t>
+              <w:t xml:space="preserve">Todo</w:t>
             </w:r>
           </w:p>
         </w:tc>
@@ -1759,7 +2657,7 @@
                 <w:sz w:val="24"/>
                 <w:szCs w:val="24"/>
               </w:rPr>
-              <w:t xml:space="preserve">Read, write, append, list, search</w:t>
+              <w:t xml:space="preserve">Add, list, complete tasks</w:t>
             </w:r>
           </w:p>
         </w:tc>
@@ -1790,7 +2688,7 @@
                 <w:sz w:val="24"/>
                 <w:szCs w:val="24"/>
               </w:rPr>
-              <w:t xml:space="preserve">Path traversal prevention, 10KB read limit</w:t>
+              <w:t xml:space="preserve">JSON file storage, UUID-based task IDs</w:t>
             </w:r>
           </w:p>
         </w:tc>
@@ -1823,7 +2721,7 @@
                 <w:sz w:val="24"/>
                 <w:szCs w:val="24"/>
               </w:rPr>
-              <w:t xml:space="preserve">Web Access</w:t>
+              <w:t xml:space="preserve">Notes</w:t>
             </w:r>
           </w:p>
         </w:tc>
@@ -1854,7 +2752,7 @@
                 <w:sz w:val="24"/>
                 <w:szCs w:val="24"/>
               </w:rPr>
-              <w:t xml:space="preserve">Fetch URLs, HTML-to-text</w:t>
+              <w:t xml:space="preserve">Daily note, journal, weekly summary</w:t>
             </w:r>
           </w:p>
         </w:tc>
@@ -1885,7 +2783,7 @@
                 <w:sz w:val="24"/>
                 <w:szCs w:val="24"/>
               </w:rPr>
-              <w:t xml:space="preserve">15s timeout, 8KB output cap</w:t>
+              <w:t xml:space="preserve">Date-scoped markdown files</w:t>
             </w:r>
           </w:p>
         </w:tc>
@@ -1918,7 +2816,7 @@
                 <w:sz w:val="24"/>
                 <w:szCs w:val="24"/>
               </w:rPr>
-              <w:t xml:space="preserve">Memory</w:t>
+              <w:t xml:space="preserve">Time</w:t>
             </w:r>
           </w:p>
         </w:tc>
@@ -1949,7 +2847,7 @@
                 <w:sz w:val="24"/>
                 <w:szCs w:val="24"/>
               </w:rPr>
-              <w:t xml:space="preserve">Store, recall, list conversations</w:t>
+              <w:t xml:space="preserve">Current time, create/list/pause reminders</w:t>
             </w:r>
           </w:p>
         </w:tc>
@@ -1980,7 +2878,7 @@
                 <w:sz w:val="24"/>
                 <w:szCs w:val="24"/>
               </w:rPr>
-              <w:t xml:space="preserve">Workspace-scoped file storage</w:t>
+              <w:t xml:space="preserve">Cron validation, scheduler integration</w:t>
             </w:r>
           </w:p>
         </w:tc>
@@ -1988,6 +2886,414 @@
     </w:tbl>
     <w:p>
       <w:pPr>
+        <w:spacing w:after="120" w:line="240"/>
+      </w:pPr>
+      <w:r>
+        <w:rPr>
+          <w:rFonts w:ascii="Times New Roman" w:cs="Times New Roman" w:eastAsia="Times New Roman" w:hAnsi="Times New Roman"/>
+          <w:b/>
+          <w:bCs/>
+          <w:color w:val="000000"/>
+          <w:sz w:val="24"/>
+          <w:szCs w:val="24"/>
+        </w:rPr>
+        <w:t xml:space="preserve">FileOpsTool </w:t>
+      </w:r>
+      <w:r>
+        <w:rPr>
+          <w:rFonts w:ascii="Times New Roman" w:cs="Times New Roman" w:eastAsia="Times New Roman" w:hAnsi="Times New Roman"/>
+          <w:color w:val="000000"/>
+          <w:sz w:val="24"/>
+          <w:szCs w:val="24"/>
+        </w:rPr>
+        <w:t xml:space="preserve">provides read, write, append, and list operations restricted to the configured data and notes directories. A resolveSafe() function validates every path against the allowed directory list, preventing path traversal attacks using sequences such as “../”.</w:t>
+      </w:r>
+    </w:p>
+    <w:p>
+      <w:pPr>
+        <w:spacing w:after="120" w:line="240"/>
+      </w:pPr>
+      <w:r>
+        <w:rPr>
+          <w:rFonts w:ascii="Times New Roman" w:cs="Times New Roman" w:eastAsia="Times New Roman" w:hAnsi="Times New Roman"/>
+          <w:b/>
+          <w:bCs/>
+          <w:color w:val="000000"/>
+          <w:sz w:val="24"/>
+          <w:szCs w:val="24"/>
+        </w:rPr>
+        <w:t xml:space="preserve">TodoTool </w:t>
+      </w:r>
+      <w:r>
+        <w:rPr>
+          <w:rFonts w:ascii="Times New Roman" w:cs="Times New Roman" w:eastAsia="Times New Roman" w:hAnsi="Times New Roman"/>
+          <w:color w:val="000000"/>
+          <w:sz w:val="24"/>
+          <w:szCs w:val="24"/>
+        </w:rPr>
+        <w:t xml:space="preserve">manages a task list stored in tasks.json with UUID-based identifiers, text descriptions, priority levels (high/medium/low), and completion status. Operations include adding tasks, listing with filter support (all/pending/done), and marking tasks complete.</w:t>
+      </w:r>
+    </w:p>
+    <w:p>
+      <w:pPr>
+        <w:spacing w:after="120" w:line="240"/>
+      </w:pPr>
+      <w:r>
+        <w:rPr>
+          <w:rFonts w:ascii="Times New Roman" w:cs="Times New Roman" w:eastAsia="Times New Roman" w:hAnsi="Times New Roman"/>
+          <w:b/>
+          <w:bCs/>
+          <w:color w:val="000000"/>
+          <w:sz w:val="24"/>
+          <w:szCs w:val="24"/>
+        </w:rPr>
+        <w:t xml:space="preserve">NotesTool </w:t>
+      </w:r>
+      <w:r>
+        <w:rPr>
+          <w:rFonts w:ascii="Times New Roman" w:cs="Times New Roman" w:eastAsia="Times New Roman" w:hAnsi="Times New Roman"/>
+          <w:color w:val="000000"/>
+          <w:sz w:val="24"/>
+          <w:szCs w:val="24"/>
+        </w:rPr>
+        <w:t xml:space="preserve">implements a daily journaling system where each day’s notes are stored as a markdown file (YYYY-MM-DD.md). The tool supports creating and reading daily notes, appending timestamped journal entries, and generating weekly summaries by concatenating the past seven days of notes.</w:t>
+      </w:r>
+    </w:p>
+    <w:p>
+      <w:pPr>
+        <w:spacing w:after="120" w:line="240"/>
+      </w:pPr>
+      <w:r>
+        <w:rPr>
+          <w:rFonts w:ascii="Times New Roman" w:cs="Times New Roman" w:eastAsia="Times New Roman" w:hAnsi="Times New Roman"/>
+          <w:b/>
+          <w:bCs/>
+          <w:color w:val="000000"/>
+          <w:sz w:val="24"/>
+          <w:szCs w:val="24"/>
+        </w:rPr>
+        <w:t xml:space="preserve">TimeTool </w:t>
+      </w:r>
+      <w:r>
+        <w:rPr>
+          <w:rFonts w:ascii="Times New Roman" w:cs="Times New Roman" w:eastAsia="Times New Roman" w:hAnsi="Times New Roman"/>
+          <w:color w:val="000000"/>
+          <w:sz w:val="24"/>
+          <w:szCs w:val="24"/>
+        </w:rPr>
+        <w:t xml:space="preserve">provides current time queries and reminder management. Reminders are stored in jobs.json with cron expressions, and creating or pausing a reminder triggers a scheduler reload callback to immediately reflect the change.</w:t>
+      </w:r>
+    </w:p>
+    <w:p>
+      <w:pPr>
+        <w:spacing w:after="120" w:before="240" w:line="240"/>
+        <w:jc w:val="left"/>
+      </w:pPr>
+      <w:r>
+        <w:rPr>
+          <w:rFonts w:ascii="Times New Roman" w:cs="Times New Roman" w:eastAsia="Times New Roman" w:hAnsi="Times New Roman"/>
+          <w:b/>
+          <w:bCs/>
+          <w:color w:val="000000"/>
+          <w:sz w:val="28"/>
+          <w:szCs w:val="28"/>
+        </w:rPr>
+        <w:t xml:space="preserve">4.2 Memory and Context System</w:t>
+      </w:r>
+    </w:p>
+    <w:p>
+      <w:pPr>
+        <w:spacing w:after="120" w:line="240"/>
+      </w:pPr>
+      <w:r>
+        <w:rPr>
+          <w:rFonts w:ascii="Times New Roman" w:cs="Times New Roman" w:eastAsia="Times New Roman" w:hAnsi="Times New Roman"/>
+          <w:color w:val="000000"/>
+          <w:sz w:val="24"/>
+          <w:szCs w:val="24"/>
+        </w:rPr>
+        <w:t xml:space="preserve">The memory system uses flat-file persistence with two markdown files: memory.md for long-term facts (timestamped entries appended as bullet points) and conversations.md for recent conversation history (auto-trimmed beyond 40 entries to prevent unbounded growth). No database infrastructure is required.</w:t>
+      </w:r>
+    </w:p>
+    <w:p>
+      <w:pPr>
+        <w:spacing w:after="120" w:line="240"/>
+      </w:pPr>
+      <w:r>
+        <w:rPr>
+          <w:rFonts w:ascii="Times New Roman" w:cs="Times New Roman" w:eastAsia="Times New Roman" w:hAnsi="Times New Roman"/>
+          <w:color w:val="000000"/>
+          <w:sz w:val="24"/>
+          <w:szCs w:val="24"/>
+        </w:rPr>
+        <w:t xml:space="preserve">The ContextLoader module assembles rich context injected into the system prompt before each LLM call. This context includes: the current date and time, all long-term memory facts, the last 10 conversation entries, a formatted list of available tools with descriptions, a summary of pending tasks from tasks.json, and a summary of active reminders from jobs.json. This comprehensive context enables the LLM to make informed decisions about which tool to invoke or how to respond, even without multi-turn reasoning.</w:t>
+      </w:r>
+    </w:p>
+    <w:p>
+      <w:pPr>
+        <w:spacing w:after="120" w:before="240" w:line="240"/>
+        <w:jc w:val="left"/>
+      </w:pPr>
+      <w:r>
+        <w:rPr>
+          <w:rFonts w:ascii="Times New Roman" w:cs="Times New Roman" w:eastAsia="Times New Roman" w:hAnsi="Times New Roman"/>
+          <w:b/>
+          <w:bCs/>
+          <w:color w:val="000000"/>
+          <w:sz w:val="28"/>
+          <w:szCs w:val="28"/>
+        </w:rPr>
+        <w:t xml:space="preserve">4.3 WhatsApp Channel</w:t>
+      </w:r>
+    </w:p>
+    <w:p>
+      <w:pPr>
+        <w:spacing w:after="120" w:line="240"/>
+      </w:pPr>
+      <w:r>
+        <w:rPr>
+          <w:rFonts w:ascii="Times New Roman" w:cs="Times New Roman" w:eastAsia="Times New Roman" w:hAnsi="Times New Roman"/>
+          <w:color w:val="000000"/>
+          <w:sz w:val="24"/>
+          <w:szCs w:val="24"/>
+        </w:rPr>
+        <w:t xml:space="preserve">The WhatsApp channel uses the @whiskeysockets/baileys library for multi-device WhatsApp Web connectivity. On first startup, the system generates a QR code in the terminal; the user scans it with their phone’s WhatsApp “Link a Device” feature. Subsequent connections use saved credentials from the whatsapp-auth/ directory, requiring no re-authentication.</w:t>
+      </w:r>
+    </w:p>
+    <w:p>
+      <w:pPr>
+        <w:spacing w:after="120" w:line="240"/>
+      </w:pPr>
+      <w:r>
+        <w:rPr>
+          <w:rFonts w:ascii="Times New Roman" w:cs="Times New Roman" w:eastAsia="Times New Roman" w:hAnsi="Times New Roman"/>
+          <w:color w:val="000000"/>
+          <w:sz w:val="24"/>
+          <w:szCs w:val="24"/>
+        </w:rPr>
+        <w:t xml:space="preserve">The channel implements several filters: group messages (@g.us JIDs) are ignored; non-text messages (images, voice, etc.) are skipped; an optional allowlist restricts which phone numbers may interact with the bot. For single-device testing, the system supports self-chat mode with WhatsApp’s LID format handling. A message ID tracking mechanism prevents the bot from processing its own replies, avoiding infinite loops.</w:t>
+      </w:r>
+    </w:p>
+    <w:p>
+      <w:pPr>
+        <w:spacing w:after="120" w:line="240"/>
+      </w:pPr>
+      <w:r>
+        <w:rPr>
+          <w:rFonts w:ascii="Times New Roman" w:cs="Times New Roman" w:eastAsia="Times New Roman" w:hAnsi="Times New Roman"/>
+          <w:color w:val="000000"/>
+          <w:sz w:val="24"/>
+          <w:szCs w:val="24"/>
+        </w:rPr>
+        <w:t xml:space="preserve">A critical technical challenge was Baileys’ bundled WhatsApp Web protocol version becoming stale, causing HTTP 405 rejections from WhatsApp’s servers. The solution calls fetchLatestWaWebVersion() at startup to dynamically retrieve the current protocol version, ensuring reliable connectivity.</w:t>
+      </w:r>
+    </w:p>
+    <w:p>
+      <w:pPr>
+        <w:spacing w:after="120" w:before="240" w:line="240"/>
+        <w:jc w:val="left"/>
+      </w:pPr>
+      <w:r>
+        <w:rPr>
+          <w:rFonts w:ascii="Times New Roman" w:cs="Times New Roman" w:eastAsia="Times New Roman" w:hAnsi="Times New Roman"/>
+          <w:b/>
+          <w:bCs/>
+          <w:color w:val="000000"/>
+          <w:sz w:val="28"/>
+          <w:szCs w:val="28"/>
+        </w:rPr>
+        <w:t xml:space="preserve">4.4 Scheduler</w:t>
+      </w:r>
+    </w:p>
+    <w:p>
+      <w:pPr>
+        <w:spacing w:after="120" w:line="240"/>
+      </w:pPr>
+      <w:r>
+        <w:rPr>
+          <w:rFonts w:ascii="Times New Roman" w:cs="Times New Roman" w:eastAsia="Times New Roman" w:hAnsi="Times New Roman"/>
+          <w:color w:val="000000"/>
+          <w:sz w:val="24"/>
+          <w:szCs w:val="24"/>
+        </w:rPr>
+        <w:t xml:space="preserve">The scheduler module reads active jobs from jobs.json and creates node-cron tasks for each valid cron expression. When a cron timer fires, the scheduler constructs an IncomingMessage with the job’s prompt text and routes it through the standard agent pipeline, delivering the result to the user via WhatsApp. The scheduler supports dynamic reloading: when the TimeTool creates or pauses a reminder, a callback triggers immediate re-reading of jobs.json and recreation of cron tasks, ensuring changes take effect without restarting the application.</w:t>
+      </w:r>
+    </w:p>
+    <w:p>
+      <w:pPr>
+        <w:spacing w:after="120" w:before="240" w:line="240"/>
+        <w:jc w:val="left"/>
+      </w:pPr>
+      <w:r>
+        <w:rPr>
+          <w:rFonts w:ascii="Times New Roman" w:cs="Times New Roman" w:eastAsia="Times New Roman" w:hAnsi="Times New Roman"/>
+          <w:b/>
+          <w:bCs/>
+          <w:color w:val="000000"/>
+          <w:sz w:val="28"/>
+          <w:szCs w:val="28"/>
+        </w:rPr>
+        <w:t xml:space="preserve">4.5 Audit and Security Model</w:t>
+      </w:r>
+    </w:p>
+    <w:p>
+      <w:pPr>
+        <w:spacing w:after="120" w:line="240"/>
+      </w:pPr>
+      <w:r>
+        <w:rPr>
+          <w:rFonts w:ascii="Times New Roman" w:cs="Times New Roman" w:eastAsia="Times New Roman" w:hAnsi="Times New Roman"/>
+          <w:color w:val="000000"/>
+          <w:sz w:val="24"/>
+          <w:szCs w:val="24"/>
+        </w:rPr>
+        <w:t xml:space="preserve">All system actions are recorded in an append-only audit.log file. Logged events include system startup and shutdown, every LLM decision with type and summary, every tool execution with success/failure status and output length, every AuthZ denial with the blocked tool name and reason, and scheduler job executions with results. This provides a complete audit trail for debugging, security review, and accountability.</w:t>
+      </w:r>
+    </w:p>
+    <w:p>
+      <w:pPr>
+        <w:spacing w:after="120" w:line="240"/>
+      </w:pPr>
+      <w:r>
+        <w:rPr>
+          <w:rFonts w:ascii="Times New Roman" w:cs="Times New Roman" w:eastAsia="Times New Roman" w:hAnsi="Times New Roman"/>
+          <w:color w:val="000000"/>
+          <w:sz w:val="24"/>
+          <w:szCs w:val="24"/>
+        </w:rPr>
+        <w:t xml:space="preserve">The security model implements defense in depth across five layers: (1) the WhatsApp allowlist restricts who can interact with the bot; (2) the single-decision architecture limits the blast radius of any individual LLM response to one tool call; (3) the AuthZ wall enforces default-deny for all tool categories; (4) file operations are path-restricted to the data/ and notes/ directories; and (5) the audit log provides after-the-fact accountability for all actions taken.</w:t>
+      </w:r>
+    </w:p>
+    <w:p>
+      <w:pPr>
+        <w:spacing w:after="120" w:before="240" w:line="240"/>
+        <w:jc w:val="left"/>
+      </w:pPr>
+      <w:r>
+        <w:rPr>
+          <w:rFonts w:ascii="Times New Roman" w:cs="Times New Roman" w:eastAsia="Times New Roman" w:hAnsi="Times New Roman"/>
+          <w:b/>
+          <w:bCs/>
+          <w:color w:val="000000"/>
+          <w:sz w:val="28"/>
+          <w:szCs w:val="28"/>
+        </w:rPr>
+        <w:t xml:space="preserve">4.6 System Prompt Design</w:t>
+      </w:r>
+    </w:p>
+    <w:p>
+      <w:pPr>
+        <w:spacing w:after="120" w:line="240"/>
+      </w:pPr>
+      <w:r>
+        <w:rPr>
+          <w:rFonts w:ascii="Times New Roman" w:cs="Times New Roman" w:eastAsia="Times New Roman" w:hAnsi="Times New Roman"/>
+          <w:color w:val="000000"/>
+          <w:sz w:val="24"/>
+          <w:szCs w:val="24"/>
+        </w:rPr>
+        <w:t xml:space="preserve">The system prompt is carefully structured to force reliable JSON output from the LLM. It consists of four sections: (1) agent identity and behavioral guidelines (helpful, concise, multilingual); (2) the three JSON response formats with exact schema examples; (3) dynamically injected context from the ContextLoader (memory, tasks, reminders, tools); and (4) a strict instruction to output only valid JSON with no additional text or markdown fences. The complete prompt template is:</w:t>
+      </w:r>
+    </w:p>
+    <w:p>
+      <w:pPr>
+        <w:spacing w:after="120" w:line="240"/>
+      </w:pPr>
+      <w:r>
+        <w:rPr>
+          <w:rFonts w:ascii="Times New Roman" w:cs="Times New Roman" w:eastAsia="Times New Roman" w:hAnsi="Times New Roman"/>
+          <w:i/>
+          <w:iCs/>
+          <w:color w:val="000000"/>
+          <w:sz w:val="22"/>
+          <w:szCs w:val="22"/>
+        </w:rPr>
+        <w:t xml:space="preserve">"You are {agentName}, a personal AI assistant connected via WhatsApp. You are helpful, concise, and proactive. You respond in the same language the user writes in. You MUST respond with exactly ONE JSON object in one of these formats: [reply/tool_call/schedule schemas]. {context}. IMPORTANT: Output ONLY valid JSON. No explanation, no markdown fences."</w:t>
+      </w:r>
+    </w:p>
+    <w:p>
+      <w:pPr>
+        <w:spacing w:after="120" w:line="240"/>
+      </w:pPr>
+      <w:r>
+        <w:rPr>
+          <w:rFonts w:ascii="Times New Roman" w:cs="Times New Roman" w:eastAsia="Times New Roman" w:hAnsi="Times New Roman"/>
+          <w:color w:val="000000"/>
+          <w:sz w:val="24"/>
+          <w:szCs w:val="24"/>
+        </w:rPr>
+        <w:t xml:space="preserve">This minimal yet directive prompt design relies on the LLM’s instruction-following capability and the structured tool descriptions in the context to guide appropriate behavior, rather than over-specifying rules that might conflict with the JSON output requirement.</w:t>
+      </w:r>
+    </w:p>
+    <w:p>
+      <w:pPr>
+        <w:spacing w:after="120" w:before="240" w:line="240"/>
+        <w:jc w:val="center"/>
+      </w:pPr>
+      <w:r>
+        <w:rPr>
+          <w:rFonts w:ascii="Times New Roman" w:cs="Times New Roman" w:eastAsia="Times New Roman" w:hAnsi="Times New Roman"/>
+          <w:b/>
+          <w:bCs/>
+          <w:color w:val="000000"/>
+          <w:sz w:val="32"/>
+          <w:szCs w:val="32"/>
+        </w:rPr>
+        <w:t xml:space="preserve">5. Demo Link and Description</w:t>
+      </w:r>
+    </w:p>
+    <w:p>
+      <w:pPr>
+        <w:spacing w:after="120" w:line="240"/>
+      </w:pPr>
+      <w:r>
+        <w:rPr>
+          <w:rFonts w:ascii="Times New Roman" w:cs="Times New Roman" w:eastAsia="Times New Roman" w:hAnsi="Times New Roman"/>
+          <w:b/>
+          <w:bCs/>
+          <w:color w:val="000000"/>
+          <w:sz w:val="24"/>
+          <w:szCs w:val="24"/>
+        </w:rPr>
+        <w:t xml:space="preserve">GitHub Repository: </w:t>
+      </w:r>
+      <w:r>
+        <w:rPr>
+          <w:rFonts w:ascii="Times New Roman" w:cs="Times New Roman" w:eastAsia="Times New Roman" w:hAnsi="Times New Roman"/>
+          <w:color w:val="000000"/>
+          <w:sz w:val="24"/>
+          <w:szCs w:val="24"/>
+        </w:rPr>
+        <w:t xml:space="preserve">https://github.com/LIJianxuanLeo/liteclaw</w:t>
+      </w:r>
+    </w:p>
+    <w:p>
+      <w:pPr>
+        <w:spacing w:after="120" w:line="240"/>
+      </w:pPr>
+      <w:r>
+        <w:rPr>
+          <w:rFonts w:ascii="Times New Roman" w:cs="Times New Roman" w:eastAsia="Times New Roman" w:hAnsi="Times New Roman"/>
+          <w:b/>
+          <w:bCs/>
+          <w:color w:val="000000"/>
+          <w:sz w:val="24"/>
+          <w:szCs w:val="24"/>
+        </w:rPr>
+        <w:t xml:space="preserve">Setup: </w:t>
+      </w:r>
+      <w:r>
+        <w:rPr>
+          <w:rFonts w:ascii="Times New Roman" w:cs="Times New Roman" w:eastAsia="Times New Roman" w:hAnsi="Times New Roman"/>
+          <w:color w:val="000000"/>
+          <w:sz w:val="24"/>
+          <w:szCs w:val="24"/>
+        </w:rPr>
+        <w:t xml:space="preserve">Clone the repository, run npm install, create a .env file with LLM_PROVIDER=gemini and a Gemini API key (free at aistudio.google.com/apikey), then run npm start. The terminal displays a QR code; scan it with WhatsApp “Link a Device” to connect. The bot begins processing messages immediately.</w:t>
+      </w:r>
+    </w:p>
+    <w:p>
+      <w:pPr>
         <w:spacing w:after="120" w:before="120" w:line="240"/>
         <w:jc w:val="center"/>
       </w:pPr>
@@ -2000,13 +3306,46 @@
           <w:sz w:val="24"/>
           <w:szCs w:val="24"/>
         </w:rPr>
-        <w:t xml:space="preserve">[Figure 4: Tool system diagram showing the four tools with their inputs and outputs — to be inserted]</w:t>
-      </w:r>
-    </w:p>
-    <w:p>
-      <w:pPr>
-        <w:spacing w:after="120" w:before="240" w:line="240"/>
-        <w:jc w:val="left"/>
+        <w:t xml:space="preserve">[Figure 3: Terminal output showing QR code generation and successful WhatsApp connection — to be inserted]</w:t>
+      </w:r>
+    </w:p>
+    <w:p>
+      <w:pPr>
+        <w:spacing w:after="120" w:before="120" w:line="240"/>
+        <w:jc w:val="center"/>
+      </w:pPr>
+      <w:r>
+        <w:rPr>
+          <w:rFonts w:ascii="Times New Roman" w:cs="Times New Roman" w:eastAsia="Times New Roman" w:hAnsi="Times New Roman"/>
+          <w:i/>
+          <w:iCs/>
+          <w:color w:val="000000"/>
+          <w:sz w:val="24"/>
+          <w:szCs w:val="24"/>
+        </w:rPr>
+        <w:t xml:space="preserve">[Figure 4: WhatsApp conversation showing user sending “你好，请介绍一下自己” and receiving AI response — to be inserted]</w:t>
+      </w:r>
+    </w:p>
+    <w:p>
+      <w:pPr>
+        <w:spacing w:after="120" w:before="120" w:line="240"/>
+        <w:jc w:val="center"/>
+      </w:pPr>
+      <w:r>
+        <w:rPr>
+          <w:rFonts w:ascii="Times New Roman" w:cs="Times New Roman" w:eastAsia="Times New Roman" w:hAnsi="Times New Roman"/>
+          <w:i/>
+          <w:iCs/>
+          <w:color w:val="000000"/>
+          <w:sz w:val="24"/>
+          <w:szCs w:val="24"/>
+        </w:rPr>
+        <w:t xml:space="preserve">[Figure 5: WhatsApp conversation showing tool call execution (e.g., adding a todo item) — to be inserted]</w:t>
+      </w:r>
+    </w:p>
+    <w:p>
+      <w:pPr>
+        <w:spacing w:after="120" w:line="240"/>
       </w:pPr>
       <w:r>
         <w:rPr>
@@ -2014,44 +3353,94 @@
           <w:b/>
           <w:bCs/>
           <w:color w:val="000000"/>
-          <w:sz w:val="28"/>
-          <w:szCs w:val="28"/>
-        </w:rPr>
-        <w:t xml:space="preserve">4.2 Memory System</w:t>
-      </w:r>
-    </w:p>
-    <w:p>
-      <w:pPr>
-        <w:spacing w:after="120" w:line="240"/>
-      </w:pPr>
-      <w:r>
-        <w:rPr>
-          <w:rFonts w:ascii="Times New Roman" w:cs="Times New Roman" w:eastAsia="Times New Roman" w:hAnsi="Times New Roman"/>
-          <w:color w:val="000000"/>
-          <w:sz w:val="24"/>
-          <w:szCs w:val="24"/>
-        </w:rPr>
-        <w:t xml:space="preserve">The memory system uses a markdown-based persistence layer that requires no database infrastructure. Facts are stored as individual markdown files in a dedicated facts/ directory, each with YAML frontmatter containing a UUID identifier, an array of tags, and a creation timestamp. The markdown body contains the fact content itself. This format is both human-readable and git-friendly, enabling version control of the agent’s knowledge base.</w:t>
-      </w:r>
-    </w:p>
-    <w:p>
-      <w:pPr>
-        <w:spacing w:after="120" w:line="240"/>
-      </w:pPr>
-      <w:r>
-        <w:rPr>
-          <w:rFonts w:ascii="Times New Roman" w:cs="Times New Roman" w:eastAsia="Times New Roman" w:hAnsi="Times New Roman"/>
-          <w:color w:val="000000"/>
-          <w:sz w:val="24"/>
-          <w:szCs w:val="24"/>
-        </w:rPr>
-        <w:t xml:space="preserve">Conversation logs are similarly stored as markdown files in a conversations/ directory. Each file preserves the full sequence of user and assistant turns, formatted with markdown headings to delineate speakers. The MemoryManager class provides methods for storing facts, recalling facts through case-insensitive substring search, saving conversation transcripts, listing conversations sorted by recency, and retrieving specific conversation histories.</w:t>
-      </w:r>
-    </w:p>
-    <w:p>
-      <w:pPr>
-        <w:spacing w:after="120" w:before="240" w:line="240"/>
-        <w:jc w:val="left"/>
+          <w:sz w:val="24"/>
+          <w:szCs w:val="24"/>
+        </w:rPr>
+        <w:t xml:space="preserve">Functional Test Results. </w:t>
+      </w:r>
+      <w:r>
+        <w:rPr>
+          <w:rFonts w:ascii="Times New Roman" w:cs="Times New Roman" w:eastAsia="Times New Roman" w:hAnsi="Times New Roman"/>
+          <w:color w:val="000000"/>
+          <w:sz w:val="24"/>
+          <w:szCs w:val="24"/>
+        </w:rPr>
+        <w:t xml:space="preserve">The system was tested end-to-end with Google Gemini 2.5 Flash as the LLM provider. All core capabilities were verified:</w:t>
+      </w:r>
+    </w:p>
+    <w:p>
+      <w:pPr>
+        <w:spacing w:after="120" w:line="240"/>
+      </w:pPr>
+      <w:r>
+        <w:rPr>
+          <w:rFonts w:ascii="Times New Roman" w:cs="Times New Roman" w:eastAsia="Times New Roman" w:hAnsi="Times New Roman"/>
+          <w:color w:val="000000"/>
+          <w:sz w:val="24"/>
+          <w:szCs w:val="24"/>
+        </w:rPr>
+        <w:t xml:space="preserve">- Natural language conversation in both English and Chinese, with the bot auto-detecting and responding in the user’s language</w:t>
+      </w:r>
+    </w:p>
+    <w:p>
+      <w:pPr>
+        <w:spacing w:after="120" w:line="240"/>
+      </w:pPr>
+      <w:r>
+        <w:rPr>
+          <w:rFonts w:ascii="Times New Roman" w:cs="Times New Roman" w:eastAsia="Times New Roman" w:hAnsi="Times New Roman"/>
+          <w:color w:val="000000"/>
+          <w:sz w:val="24"/>
+          <w:szCs w:val="24"/>
+        </w:rPr>
+        <w:t xml:space="preserve">- Task management: adding tasks via natural language (“帮我添加一个任务：买牛奶”), listing pending items, marking tasks complete</w:t>
+      </w:r>
+    </w:p>
+    <w:p>
+      <w:pPr>
+        <w:spacing w:after="120" w:line="240"/>
+      </w:pPr>
+      <w:r>
+        <w:rPr>
+          <w:rFonts w:ascii="Times New Roman" w:cs="Times New Roman" w:eastAsia="Times New Roman" w:hAnsi="Times New Roman"/>
+          <w:color w:val="000000"/>
+          <w:sz w:val="24"/>
+          <w:szCs w:val="24"/>
+        </w:rPr>
+        <w:t xml:space="preserve">- Daily journaling: creating notes, appending timestamped entries, retrieving weekly summaries</w:t>
+      </w:r>
+    </w:p>
+    <w:p>
+      <w:pPr>
+        <w:spacing w:after="120" w:line="240"/>
+      </w:pPr>
+      <w:r>
+        <w:rPr>
+          <w:rFonts w:ascii="Times New Roman" w:cs="Times New Roman" w:eastAsia="Times New Roman" w:hAnsi="Times New Roman"/>
+          <w:color w:val="000000"/>
+          <w:sz w:val="24"/>
+          <w:szCs w:val="24"/>
+        </w:rPr>
+        <w:t xml:space="preserve">- Scheduled reminders: creating cron-based reminders delivered via WhatsApp at specified intervals</w:t>
+      </w:r>
+    </w:p>
+    <w:p>
+      <w:pPr>
+        <w:spacing w:after="120" w:line="240"/>
+      </w:pPr>
+      <w:r>
+        <w:rPr>
+          <w:rFonts w:ascii="Times New Roman" w:cs="Times New Roman" w:eastAsia="Times New Roman" w:hAnsi="Times New Roman"/>
+          <w:color w:val="000000"/>
+          <w:sz w:val="24"/>
+          <w:szCs w:val="24"/>
+        </w:rPr>
+        <w:t xml:space="preserve">- AuthZ enforcement: blocked tool calls logged to audit trail with denial reasons</w:t>
+      </w:r>
+    </w:p>
+    <w:p>
+      <w:pPr>
+        <w:spacing w:after="120" w:line="240"/>
       </w:pPr>
       <w:r>
         <w:rPr>
@@ -2059,326 +3448,19 @@
           <w:b/>
           <w:bCs/>
           <w:color w:val="000000"/>
-          <w:sz w:val="28"/>
-          <w:szCs w:val="28"/>
-        </w:rPr>
-        <w:t xml:space="preserve">4.3 Skill System</w:t>
-      </w:r>
-    </w:p>
-    <w:p>
-      <w:pPr>
-        <w:spacing w:after="120" w:line="240"/>
-      </w:pPr>
-      <w:r>
-        <w:rPr>
-          <w:rFonts w:ascii="Times New Roman" w:cs="Times New Roman" w:eastAsia="Times New Roman" w:hAnsi="Times New Roman"/>
-          <w:color w:val="000000"/>
-          <w:sz w:val="24"/>
-          <w:szCs w:val="24"/>
-        </w:rPr>
-        <w:t xml:space="preserve">Skills represent a code-free extension mechanism for the agent’s behavioral repertoire. Each skill is defined as a markdown file with YAML frontmatter specifying a name, description, an array of trigger keywords, and a list of tools the skill may use. The markdown body contains natural language instructions that are injected into the system prompt when the Skill Loader detects a trigger match in the user’s input. This design allows non-programmers to extend the agent by writing instructions in plain English, without modifying any source code.</w:t>
-      </w:r>
-    </w:p>
-    <w:p>
-      <w:pPr>
-        <w:spacing w:after="120" w:before="240" w:line="240"/>
-        <w:jc w:val="left"/>
-      </w:pPr>
-      <w:r>
-        <w:rPr>
-          <w:rFonts w:ascii="Times New Roman" w:cs="Times New Roman" w:eastAsia="Times New Roman" w:hAnsi="Times New Roman"/>
-          <w:b/>
-          <w:bCs/>
-          <w:color w:val="000000"/>
-          <w:sz w:val="28"/>
-          <w:szCs w:val="28"/>
-        </w:rPr>
-        <w:t xml:space="preserve">4.4 System Prompt Design</w:t>
-      </w:r>
-    </w:p>
-    <w:p>
-      <w:pPr>
-        <w:spacing w:after="120" w:line="240"/>
-      </w:pPr>
-      <w:r>
-        <w:rPr>
-          <w:rFonts w:ascii="Times New Roman" w:cs="Times New Roman" w:eastAsia="Times New Roman" w:hAnsi="Times New Roman"/>
-          <w:color w:val="000000"/>
-          <w:sz w:val="24"/>
-          <w:szCs w:val="24"/>
-        </w:rPr>
-        <w:t xml:space="preserve">The system prompt is deliberately concise and directive, consisting of six sentences that establish the agent’s identity, enumerate its capabilities, and instruct it to reason step-by-step and use tools iteratively. The full prompt reads:</w:t>
-      </w:r>
-    </w:p>
-    <w:p>
-      <w:pPr>
-        <w:spacing w:after="120" w:line="240"/>
-      </w:pPr>
-      <w:r>
-        <w:rPr>
-          <w:rFonts w:ascii="Times New Roman" w:cs="Times New Roman" w:eastAsia="Times New Roman" w:hAnsi="Times New Roman"/>
-          <w:i/>
-          <w:iCs/>
-          <w:color w:val="000000"/>
-          <w:sz w:val="24"/>
-          <w:szCs w:val="24"/>
-        </w:rPr>
-        <w:t xml:space="preserve">“You are {agentName}, a helpful AI assistant with access to tools. You can use tools to interact with the user’s system: execute shell commands, read/write files, fetch web pages, and manage memory. When using tools, think step by step about what you need to accomplish. Be concise and direct in your responses. If a task requires multiple steps, use tools iteratively until the task is complete.”</w:t>
-      </w:r>
-    </w:p>
-    <w:p>
-      <w:pPr>
-        <w:spacing w:after="120" w:line="240"/>
-      </w:pPr>
-      <w:r>
-        <w:rPr>
-          <w:rFonts w:ascii="Times New Roman" w:cs="Times New Roman" w:eastAsia="Times New Roman" w:hAnsi="Times New Roman"/>
-          <w:color w:val="000000"/>
-          <w:sz w:val="24"/>
-          <w:szCs w:val="24"/>
-        </w:rPr>
-        <w:t xml:space="preserve">This minimal prompt design reflects a deliberate choice: rather than over-specifying the agent’s behavior, we rely on the LLM’s inherent instruction-following capabilities and the structured tool definitions to guide appropriate tool selection and usage.</w:t>
-      </w:r>
-    </w:p>
-    <w:p>
-      <w:pPr>
-        <w:spacing w:after="120" w:before="240" w:line="240"/>
-        <w:jc w:val="center"/>
-      </w:pPr>
-      <w:r>
-        <w:rPr>
-          <w:rFonts w:ascii="Times New Roman" w:cs="Times New Roman" w:eastAsia="Times New Roman" w:hAnsi="Times New Roman"/>
-          <w:b/>
-          <w:bCs/>
-          <w:color w:val="000000"/>
-          <w:sz w:val="32"/>
-          <w:szCs w:val="32"/>
-        </w:rPr>
-        <w:t xml:space="preserve">5. Implementation Details</w:t>
-      </w:r>
-    </w:p>
-    <w:p>
-      <w:pPr>
-        <w:spacing w:after="120" w:before="240" w:line="240"/>
-        <w:jc w:val="left"/>
-      </w:pPr>
-      <w:r>
-        <w:rPr>
-          <w:rFonts w:ascii="Times New Roman" w:cs="Times New Roman" w:eastAsia="Times New Roman" w:hAnsi="Times New Roman"/>
-          <w:b/>
-          <w:bCs/>
-          <w:color w:val="000000"/>
-          <w:sz w:val="28"/>
-          <w:szCs w:val="28"/>
-        </w:rPr>
-        <w:t xml:space="preserve">5.1 Technology Stack</w:t>
-      </w:r>
-    </w:p>
-    <w:p>
-      <w:pPr>
-        <w:spacing w:after="120" w:line="240"/>
-      </w:pPr>
-      <w:r>
-        <w:rPr>
-          <w:rFonts w:ascii="Times New Roman" w:cs="Times New Roman" w:eastAsia="Times New Roman" w:hAnsi="Times New Roman"/>
-          <w:color w:val="000000"/>
-          <w:sz w:val="24"/>
-          <w:szCs w:val="24"/>
-        </w:rPr>
-        <w:t xml:space="preserve">LiteClaw is built on the Node.js runtime with TypeScript for compile-time type safety. The backend uses Express.js for HTTP API endpoints and the ws library for WebSocket communication. The frontend is a React single-page application built with the Vite bundler. The entire project requires only six production dependencies: @anthropic-ai/sdk (Anthropic LLM client), openai (OpenAI-compatible client for Groq, Gemini, and DeepSeek), express (HTTP server), ws (WebSocket server), dotenv (environment configuration), and zod (schema validation).</w:t>
-      </w:r>
-    </w:p>
-    <w:p>
-      <w:pPr>
-        <w:spacing w:after="120" w:before="240" w:line="240"/>
-        <w:jc w:val="left"/>
-      </w:pPr>
-      <w:r>
-        <w:rPr>
-          <w:rFonts w:ascii="Times New Roman" w:cs="Times New Roman" w:eastAsia="Times New Roman" w:hAnsi="Times New Roman"/>
-          <w:b/>
-          <w:bCs/>
-          <w:color w:val="000000"/>
-          <w:sz w:val="28"/>
-          <w:szCs w:val="28"/>
-        </w:rPr>
-        <w:t xml:space="preserve">5.2 Project Structure</w:t>
-      </w:r>
-    </w:p>
-    <w:p>
-      <w:pPr>
-        <w:spacing w:after="120" w:line="240"/>
-      </w:pPr>
-      <w:r>
-        <w:rPr>
-          <w:rFonts w:ascii="Times New Roman" w:cs="Times New Roman" w:eastAsia="Times New Roman" w:hAnsi="Times New Roman"/>
-          <w:color w:val="000000"/>
-          <w:sz w:val="24"/>
-          <w:szCs w:val="24"/>
-        </w:rPr>
-        <w:t xml:space="preserve">The project is organized into a clear directory hierarchy. The src/ directory contains seven subdirectories: core/ (agent loop, LLM client, tool registry, types), tools/ (four tool implementations plus base class), server/ (Express API and WebSocket handler), memory/ (memory manager and types), skills/ (skill loader and types), channels/ (CLI interface), and utils/ (configuration, logging, schema conversion). The web/ directory contains the React frontend with components/, hooks/, and styles/ subdirectories. Additional top-level directories include skills/ for skill definition files and memory/ for runtime storage.</w:t>
-      </w:r>
-    </w:p>
-    <w:p>
-      <w:pPr>
-        <w:spacing w:after="120" w:before="240" w:line="240"/>
-        <w:jc w:val="left"/>
-      </w:pPr>
-      <w:r>
-        <w:rPr>
-          <w:rFonts w:ascii="Times New Roman" w:cs="Times New Roman" w:eastAsia="Times New Roman" w:hAnsi="Times New Roman"/>
-          <w:b/>
-          <w:bCs/>
-          <w:color w:val="000000"/>
-          <w:sz w:val="28"/>
-          <w:szCs w:val="28"/>
-        </w:rPr>
-        <w:t xml:space="preserve">5.3 Building the Agent Step-by-Step</w:t>
-      </w:r>
-    </w:p>
-    <w:p>
-      <w:pPr>
-        <w:spacing w:after="120" w:line="240"/>
-      </w:pPr>
-      <w:r>
-        <w:rPr>
-          <w:rFonts w:ascii="Times New Roman" w:cs="Times New Roman" w:eastAsia="Times New Roman" w:hAnsi="Times New Roman"/>
-          <w:color w:val="000000"/>
-          <w:sz w:val="24"/>
-          <w:szCs w:val="24"/>
-        </w:rPr>
-        <w:t xml:space="preserve">The implementation proceeded in four distinct phases, each building upon the previous one.</w:t>
-      </w:r>
-    </w:p>
-    <w:p>
-      <w:pPr>
-        <w:spacing w:after="120" w:line="240"/>
-      </w:pPr>
-      <w:r>
-        <w:rPr>
-          <w:rFonts w:ascii="Times New Roman" w:cs="Times New Roman" w:eastAsia="Times New Roman" w:hAnsi="Times New Roman"/>
-          <w:b/>
-          <w:bCs/>
-          <w:color w:val="000000"/>
-          <w:sz w:val="24"/>
-          <w:szCs w:val="24"/>
-        </w:rPr>
-        <w:t xml:space="preserve">Phase 1 — Foundation: </w:t>
-      </w:r>
-      <w:r>
-        <w:rPr>
-          <w:rFonts w:ascii="Times New Roman" w:cs="Times New Roman" w:eastAsia="Times New Roman" w:hAnsi="Times New Roman"/>
-          <w:color w:val="000000"/>
-          <w:sz w:val="24"/>
-          <w:szCs w:val="24"/>
-        </w:rPr>
-        <w:t xml:space="preserve">The first phase established the core infrastructure: shared TypeScript interfaces, the environment configuration loader, the LLM client wrapper with multi-provider support, an initially empty tool registry, the agent loop implementing the ReAct state machine, the CLI channel for interactive terminal use, and the bootstrap entry point that wires all components together.</w:t>
-      </w:r>
-    </w:p>
-    <w:p>
-      <w:pPr>
-        <w:spacing w:after="120" w:line="240"/>
-      </w:pPr>
-      <w:r>
-        <w:rPr>
-          <w:rFonts w:ascii="Times New Roman" w:cs="Times New Roman" w:eastAsia="Times New Roman" w:hAnsi="Times New Roman"/>
-          <w:b/>
-          <w:bCs/>
-          <w:color w:val="000000"/>
-          <w:sz w:val="24"/>
-          <w:szCs w:val="24"/>
-        </w:rPr>
-        <w:t xml:space="preserve">Phase 2 — Tool System: </w:t>
-      </w:r>
-      <w:r>
-        <w:rPr>
-          <w:rFonts w:ascii="Times New Roman" w:cs="Times New Roman" w:eastAsia="Times New Roman" w:hAnsi="Times New Roman"/>
-          <w:color w:val="000000"/>
-          <w:sz w:val="24"/>
-          <w:szCs w:val="24"/>
-        </w:rPr>
-        <w:t xml:space="preserve">The second phase implemented the base Tool abstract class followed by the four concrete tools (shell, file operations, web access). Each tool was registered with the Tool Registry, and the agent loop was enhanced to support multi-turn tool use, correctly formatting tool results as conversation messages for subsequent LLM invocations.</w:t>
-      </w:r>
-    </w:p>
-    <w:p>
-      <w:pPr>
-        <w:spacing w:after="120" w:line="240"/>
-      </w:pPr>
-      <w:r>
-        <w:rPr>
-          <w:rFonts w:ascii="Times New Roman" w:cs="Times New Roman" w:eastAsia="Times New Roman" w:hAnsi="Times New Roman"/>
-          <w:b/>
-          <w:bCs/>
-          <w:color w:val="000000"/>
-          <w:sz w:val="24"/>
-          <w:szCs w:val="24"/>
-        </w:rPr>
-        <w:t xml:space="preserve">Phase 3 — Memory Persistence: </w:t>
-      </w:r>
-      <w:r>
-        <w:rPr>
-          <w:rFonts w:ascii="Times New Roman" w:cs="Times New Roman" w:eastAsia="Times New Roman" w:hAnsi="Times New Roman"/>
-          <w:color w:val="000000"/>
-          <w:sz w:val="24"/>
-          <w:szCs w:val="24"/>
-        </w:rPr>
-        <w:t xml:space="preserve">The third phase added the memory type definitions, the MemoryManager class with markdown file read/write operations, the MemoryTool for LLM-accessible memory operations, and automatic conversation log saving after each exchange.</w:t>
-      </w:r>
-    </w:p>
-    <w:p>
-      <w:pPr>
-        <w:spacing w:after="120" w:line="240"/>
-      </w:pPr>
-      <w:r>
-        <w:rPr>
-          <w:rFonts w:ascii="Times New Roman" w:cs="Times New Roman" w:eastAsia="Times New Roman" w:hAnsi="Times New Roman"/>
-          <w:b/>
-          <w:bCs/>
-          <w:color w:val="000000"/>
-          <w:sz w:val="24"/>
-          <w:szCs w:val="24"/>
-        </w:rPr>
-        <w:t xml:space="preserve">Phase 4 — Web Interface: </w:t>
-      </w:r>
-      <w:r>
-        <w:rPr>
-          <w:rFonts w:ascii="Times New Roman" w:cs="Times New Roman" w:eastAsia="Times New Roman" w:hAnsi="Times New Roman"/>
-          <w:color w:val="000000"/>
-          <w:sz w:val="24"/>
-          <w:szCs w:val="24"/>
-        </w:rPr>
-        <w:t xml:space="preserve">The final phase introduced the Express HTTP API with REST endpoints, the WebSocket server for real-time event streaming, and the React single-page application with ChatWindow, MessageBubble, ToolCallCard components and the useChat hook for WebSocket state management.</w:t>
-      </w:r>
-    </w:p>
-    <w:p>
-      <w:pPr>
-        <w:spacing w:after="120" w:before="240" w:line="240"/>
-        <w:jc w:val="left"/>
-      </w:pPr>
-      <w:r>
-        <w:rPr>
-          <w:rFonts w:ascii="Times New Roman" w:cs="Times New Roman" w:eastAsia="Times New Roman" w:hAnsi="Times New Roman"/>
-          <w:b/>
-          <w:bCs/>
-          <w:color w:val="000000"/>
-          <w:sz w:val="28"/>
-          <w:szCs w:val="28"/>
-        </w:rPr>
-        <w:t xml:space="preserve">5.4 Code Metrics</w:t>
-      </w:r>
-    </w:p>
-    <w:p>
-      <w:pPr>
-        <w:spacing w:after="120" w:line="240"/>
-      </w:pPr>
-      <w:r>
-        <w:rPr>
-          <w:rFonts w:ascii="Times New Roman" w:cs="Times New Roman" w:eastAsia="Times New Roman" w:hAnsi="Times New Roman"/>
-          <w:color w:val="000000"/>
-          <w:sz w:val="24"/>
-          <w:szCs w:val="24"/>
-        </w:rPr>
-        <w:t xml:space="preserve">Table 3 presents a comparative analysis of code complexity across the three agent frameworks. LiteClaw achieves a 99.6% reduction in lines of code compared to OpenClaw while retaining the core capabilities of autonomous multi-tool reasoning, persistent memory, and web-based interaction.</w:t>
+          <w:sz w:val="24"/>
+          <w:szCs w:val="24"/>
+        </w:rPr>
+        <w:t xml:space="preserve">Code Metrics. </w:t>
+      </w:r>
+      <w:r>
+        <w:rPr>
+          <w:rFonts w:ascii="Times New Roman" w:cs="Times New Roman" w:eastAsia="Times New Roman" w:hAnsi="Times New Roman"/>
+          <w:color w:val="000000"/>
+          <w:sz w:val="24"/>
+          <w:szCs w:val="24"/>
+        </w:rPr>
+        <w:t xml:space="preserve">Table 4 compares LiteClaw against established agent frameworks, demonstrating that practical AI agent functionality can be achieved with a 99.6% reduction in code complexity compared to production-grade frameworks.</w:t>
       </w:r>
     </w:p>
     <w:p>
@@ -2397,7 +3479,7 @@
           <w:sz w:val="24"/>
           <w:szCs w:val="24"/>
         </w:rPr>
-        <w:t xml:space="preserve">Table 3: Code Complexity Comparison</w:t>
+        <w:t xml:space="preserve">Table 4: Code Complexity Comparison</w:t>
       </w:r>
     </w:p>
     <w:tbl>
@@ -2770,7 +3852,7 @@
                 <w:sz w:val="24"/>
                 <w:szCs w:val="24"/>
               </w:rPr>
-              <w:t xml:space="preserve">~2,049</w:t>
+              <w:t xml:space="preserve">~1,800</w:t>
             </w:r>
           </w:p>
         </w:tc>
@@ -2807,274 +3889,6 @@
         </w:tc>
       </w:tr>
     </w:tbl>
-    <w:p>
-      <w:pPr>
-        <w:spacing w:after="120" w:before="240" w:line="240"/>
-        <w:jc w:val="center"/>
-      </w:pPr>
-      <w:r>
-        <w:rPr>
-          <w:rFonts w:ascii="Times New Roman" w:cs="Times New Roman" w:eastAsia="Times New Roman" w:hAnsi="Times New Roman"/>
-          <w:b/>
-          <w:bCs/>
-          <w:color w:val="000000"/>
-          <w:sz w:val="32"/>
-          <w:szCs w:val="32"/>
-        </w:rPr>
-        <w:t xml:space="preserve">6. Web Interface</w:t>
-      </w:r>
-    </w:p>
-    <w:p>
-      <w:pPr>
-        <w:spacing w:after="120" w:before="240" w:line="240"/>
-        <w:jc w:val="left"/>
-      </w:pPr>
-      <w:r>
-        <w:rPr>
-          <w:rFonts w:ascii="Times New Roman" w:cs="Times New Roman" w:eastAsia="Times New Roman" w:hAnsi="Times New Roman"/>
-          <w:b/>
-          <w:bCs/>
-          <w:color w:val="000000"/>
-          <w:sz w:val="28"/>
-          <w:szCs w:val="28"/>
-        </w:rPr>
-        <w:t xml:space="preserve">6.1 Backend API</w:t>
-      </w:r>
-    </w:p>
-    <w:p>
-      <w:pPr>
-        <w:spacing w:after="120" w:line="240"/>
-      </w:pPr>
-      <w:r>
-        <w:rPr>
-          <w:rFonts w:ascii="Times New Roman" w:cs="Times New Roman" w:eastAsia="Times New Roman" w:hAnsi="Times New Roman"/>
-          <w:color w:val="000000"/>
-          <w:sz w:val="24"/>
-          <w:szCs w:val="24"/>
-        </w:rPr>
-        <w:t xml:space="preserve">The backend exposes two communication channels. An Express HTTP server provides REST endpoints: POST /api/chat accepts user messages and returns agent responses, while GET /api/conversations retrieves conversation history metadata. For real-time interaction, a WebSocket endpoint at /ws enables bidirectional streaming communication between the frontend and the agent.</w:t>
-      </w:r>
-    </w:p>
-    <w:p>
-      <w:pPr>
-        <w:spacing w:after="120" w:before="240" w:line="240"/>
-        <w:jc w:val="left"/>
-      </w:pPr>
-      <w:r>
-        <w:rPr>
-          <w:rFonts w:ascii="Times New Roman" w:cs="Times New Roman" w:eastAsia="Times New Roman" w:hAnsi="Times New Roman"/>
-          <w:b/>
-          <w:bCs/>
-          <w:color w:val="000000"/>
-          <w:sz w:val="28"/>
-          <w:szCs w:val="28"/>
-        </w:rPr>
-        <w:t xml:space="preserve">6.2 Frontend Architecture</w:t>
-      </w:r>
-    </w:p>
-    <w:p>
-      <w:pPr>
-        <w:spacing w:after="120" w:line="240"/>
-      </w:pPr>
-      <w:r>
-        <w:rPr>
-          <w:rFonts w:ascii="Times New Roman" w:cs="Times New Roman" w:eastAsia="Times New Roman" w:hAnsi="Times New Roman"/>
-          <w:color w:val="000000"/>
-          <w:sz w:val="24"/>
-          <w:szCs w:val="24"/>
-        </w:rPr>
-        <w:t xml:space="preserve">The frontend is a React single-page application consisting of four primary components. ChatWindow renders the scrollable message list and input area with auto-scroll behavior. MessageBubble displays individual user and assistant messages with markdown rendering support. ToolCallCard provides collapsible cards that visualize tool executions, showing the tool name, input parameters, execution status, and output. StatusBar indicates the current agent state (idle, thinking, or executing tools) and WebSocket connection status. The useChat custom hook encapsulates all WebSocket logic including automatic reconnection on disconnection, message state management, and streaming text accumulation.</w:t>
-      </w:r>
-    </w:p>
-    <w:p>
-      <w:pPr>
-        <w:spacing w:after="120" w:before="240" w:line="240"/>
-        <w:jc w:val="left"/>
-      </w:pPr>
-      <w:r>
-        <w:rPr>
-          <w:rFonts w:ascii="Times New Roman" w:cs="Times New Roman" w:eastAsia="Times New Roman" w:hAnsi="Times New Roman"/>
-          <w:b/>
-          <w:bCs/>
-          <w:color w:val="000000"/>
-          <w:sz w:val="28"/>
-          <w:szCs w:val="28"/>
-        </w:rPr>
-        <w:t xml:space="preserve">6.3 Event Streaming Protocol</w:t>
-      </w:r>
-    </w:p>
-    <w:p>
-      <w:pPr>
-        <w:spacing w:after="120" w:line="240"/>
-      </w:pPr>
-      <w:r>
-        <w:rPr>
-          <w:rFonts w:ascii="Times New Roman" w:cs="Times New Roman" w:eastAsia="Times New Roman" w:hAnsi="Times New Roman"/>
-          <w:color w:val="000000"/>
-          <w:sz w:val="24"/>
-          <w:szCs w:val="24"/>
-        </w:rPr>
-        <w:t xml:space="preserve">Six event types flow over the WebSocket connection to enable real-time UI updates. The status event communicates agent state transitions (idle, thinking, tool_execution). The tool_call event signals that a tool execution has begun, including the tool name and input parameters. The tool_result event delivers the tool’s output and success/failure status. The text_delta event streams incremental text fragments as the LLM generates its response. The message_complete event delivers the finalized message with all tool call records. The error event handles exceptional conditions. This protocol enables the frontend to display live thinking indicators, tool execution progress, and character-by-character response streaming.</w:t>
-      </w:r>
-    </w:p>
-    <w:p>
-      <w:pPr>
-        <w:spacing w:after="120" w:before="120" w:line="240"/>
-        <w:jc w:val="center"/>
-      </w:pPr>
-      <w:r>
-        <w:rPr>
-          <w:rFonts w:ascii="Times New Roman" w:cs="Times New Roman" w:eastAsia="Times New Roman" w:hAnsi="Times New Roman"/>
-          <w:i/>
-          <w:iCs/>
-          <w:color w:val="000000"/>
-          <w:sz w:val="24"/>
-          <w:szCs w:val="24"/>
-        </w:rPr>
-        <w:t xml:space="preserve">[Figure 5: Screenshot of web UI showing a tool call card during execution — to be inserted]</w:t>
-      </w:r>
-    </w:p>
-    <w:p>
-      <w:pPr>
-        <w:spacing w:after="120" w:before="240" w:line="240"/>
-        <w:jc w:val="center"/>
-      </w:pPr>
-      <w:r>
-        <w:rPr>
-          <w:rFonts w:ascii="Times New Roman" w:cs="Times New Roman" w:eastAsia="Times New Roman" w:hAnsi="Times New Roman"/>
-          <w:b/>
-          <w:bCs/>
-          <w:color w:val="000000"/>
-          <w:sz w:val="32"/>
-          <w:szCs w:val="32"/>
-        </w:rPr>
-        <w:t xml:space="preserve">7. Evaluation and Conclusion</w:t>
-      </w:r>
-    </w:p>
-    <w:p>
-      <w:pPr>
-        <w:spacing w:after="120" w:before="240" w:line="240"/>
-        <w:jc w:val="left"/>
-      </w:pPr>
-      <w:r>
-        <w:rPr>
-          <w:rFonts w:ascii="Times New Roman" w:cs="Times New Roman" w:eastAsia="Times New Roman" w:hAnsi="Times New Roman"/>
-          <w:b/>
-          <w:bCs/>
-          <w:color w:val="000000"/>
-          <w:sz w:val="28"/>
-          <w:szCs w:val="28"/>
-        </w:rPr>
-        <w:t xml:space="preserve">7.1 Capabilities</w:t>
-      </w:r>
-    </w:p>
-    <w:p>
-      <w:pPr>
-        <w:spacing w:after="120" w:line="240"/>
-      </w:pPr>
-      <w:r>
-        <w:rPr>
-          <w:rFonts w:ascii="Times New Roman" w:cs="Times New Roman" w:eastAsia="Times New Roman" w:hAnsi="Times New Roman"/>
-          <w:color w:val="000000"/>
-          <w:sz w:val="24"/>
-          <w:szCs w:val="24"/>
-        </w:rPr>
-        <w:t xml:space="preserve">LiteClaw demonstrates capability across several practical scenarios. The agent can perform multi-step file editing tasks, such as creating a project scaffold by sequentially creating directories, writing configuration files, and populating source files. It can conduct web research by fetching web pages, extracting relevant content, and summarizing findings. The persistent memory system allows the agent to recall facts and conversation context across sessions, enabling continuity in long-running projects. The multi-provider support means users can operate the agent at zero monetary cost by selecting the Groq or Google Gemini free tiers, removing the financial barrier that limits adoption of many agent frameworks.</w:t>
-      </w:r>
-    </w:p>
-    <w:p>
-      <w:pPr>
-        <w:spacing w:after="120" w:before="240" w:line="240"/>
-        <w:jc w:val="left"/>
-      </w:pPr>
-      <w:r>
-        <w:rPr>
-          <w:rFonts w:ascii="Times New Roman" w:cs="Times New Roman" w:eastAsia="Times New Roman" w:hAnsi="Times New Roman"/>
-          <w:b/>
-          <w:bCs/>
-          <w:color w:val="000000"/>
-          <w:sz w:val="28"/>
-          <w:szCs w:val="28"/>
-        </w:rPr>
-        <w:t xml:space="preserve">7.2 Limitations</w:t>
-      </w:r>
-    </w:p>
-    <w:p>
-      <w:pPr>
-        <w:spacing w:after="120" w:line="240"/>
-      </w:pPr>
-      <w:r>
-        <w:rPr>
-          <w:rFonts w:ascii="Times New Roman" w:cs="Times New Roman" w:eastAsia="Times New Roman" w:hAnsi="Times New Roman"/>
-          <w:color w:val="000000"/>
-          <w:sz w:val="24"/>
-          <w:szCs w:val="24"/>
-        </w:rPr>
-        <w:t xml:space="preserve">Several limitations warrant acknowledgment. The current implementation lacks streaming support for the Anthropic provider, meaning responses arrive as complete blocks rather than character-by-character. Container isolation for tool execution is not yet implemented, relying instead on software-level safeguards (command denylist, path traversal prevention) that are less robust than process-level isolation. The project does not include an automated test suite, though the testing infrastructure (Vitest) is configured. Finally, the system is designed for single-user operation and does not include authentication or session management for multi-user deployments.</w:t>
-      </w:r>
-    </w:p>
-    <w:p>
-      <w:pPr>
-        <w:spacing w:after="120" w:before="240" w:line="240"/>
-        <w:jc w:val="left"/>
-      </w:pPr>
-      <w:r>
-        <w:rPr>
-          <w:rFonts w:ascii="Times New Roman" w:cs="Times New Roman" w:eastAsia="Times New Roman" w:hAnsi="Times New Roman"/>
-          <w:b/>
-          <w:bCs/>
-          <w:color w:val="000000"/>
-          <w:sz w:val="28"/>
-          <w:szCs w:val="28"/>
-        </w:rPr>
-        <w:t xml:space="preserve">7.3 Future Work</w:t>
-      </w:r>
-    </w:p>
-    <w:p>
-      <w:pPr>
-        <w:spacing w:after="120" w:line="240"/>
-      </w:pPr>
-      <w:r>
-        <w:rPr>
-          <w:rFonts w:ascii="Times New Roman" w:cs="Times New Roman" w:eastAsia="Times New Roman" w:hAnsi="Times New Roman"/>
-          <w:color w:val="000000"/>
-          <w:sz w:val="24"/>
-          <w:szCs w:val="24"/>
-        </w:rPr>
-        <w:t xml:space="preserve">Planned improvements include Docker-based sandboxing for tool execution, providing process-level isolation for shell commands and file operations. Additional tools for database queries and static code analysis are under consideration. A Telegram bot channel would extend the agent’s accessibility to mobile users. Multi-user authentication and session management would enable shared deployments. Comprehensive unit and integration test coverage remains a priority for production readiness.</w:t>
-      </w:r>
-    </w:p>
-    <w:p>
-      <w:pPr>
-        <w:spacing w:after="120" w:before="240" w:line="240"/>
-        <w:jc w:val="left"/>
-      </w:pPr>
-      <w:r>
-        <w:rPr>
-          <w:rFonts w:ascii="Times New Roman" w:cs="Times New Roman" w:eastAsia="Times New Roman" w:hAnsi="Times New Roman"/>
-          <w:b/>
-          <w:bCs/>
-          <w:color w:val="000000"/>
-          <w:sz w:val="28"/>
-          <w:szCs w:val="28"/>
-        </w:rPr>
-        <w:t xml:space="preserve">7.4 Conclusion</w:t>
-      </w:r>
-    </w:p>
-    <w:p>
-      <w:pPr>
-        <w:spacing w:after="120" w:line="240"/>
-      </w:pPr>
-      <w:r>
-        <w:rPr>
-          <w:rFonts w:ascii="Times New Roman" w:cs="Times New Roman" w:eastAsia="Times New Roman" w:hAnsi="Times New Roman"/>
-          <w:color w:val="000000"/>
-          <w:sz w:val="24"/>
-          <w:szCs w:val="24"/>
-        </w:rPr>
-        <w:t xml:space="preserve">LiteClaw demonstrates that a capable AI agent framework need not be complex. At approximately 2,000 lines of TypeScript, it implements the full ReAct agent loop with four tools, persistent markdown-based memory, an extensible code-free skill system, and a real-time web interface with WebSocket streaming. It supports both free and paid LLM providers through a clean adapter pattern, enabling zero-cost operation for moderate usage. This work contributes a practical reference architecture for developers and researchers seeking to build, understand, or customize autonomous AI agents without the overhead of production-scale frameworks.</w:t>
-      </w:r>
-    </w:p>
     <w:p>
       <w:pPr>
         <w:spacing w:after="120" w:before="240" w:line="240"/>
@@ -3127,7 +3941,7 @@
           <w:sz w:val="24"/>
           <w:szCs w:val="24"/>
         </w:rPr>
-        <w:t xml:space="preserve">OpenClaw. (2025). OpenClaw: Open-source AI Agent Framework. GitHub repository.</w:t>
+        <w:t xml:space="preserve">WhiskeySockets. (2026). “Baileys: WhatsApp Web API for Node.js.” GitHub repository. https://github.com/WhiskeySockets/Baileys</w:t>
       </w:r>
     </w:p>
     <w:p>
@@ -3146,7 +3960,7 @@
           <w:sz w:val="24"/>
           <w:szCs w:val="24"/>
         </w:rPr>
-        <w:t xml:space="preserve">NanoClaw. (2025). NanoClaw: Minimal AI Agent. GitHub repository.</w:t>
+        <w:t xml:space="preserve">Google. (2026). “Gemini API Documentation.” https://ai.google.dev/gemini-api/docs</w:t>
       </w:r>
     </w:p>
     <w:p>
@@ -3165,7 +3979,7 @@
           <w:sz w:val="24"/>
           <w:szCs w:val="24"/>
         </w:rPr>
-        <w:t xml:space="preserve">Anthropic. (2025). “Tool Use with Claude.” Anthropic Documentation.</w:t>
+        <w:t xml:space="preserve">Groq. (2026). “Groq API Documentation.” https://console.groq.com/docs</w:t>
       </w:r>
     </w:p>
     <w:p>
@@ -3184,7 +3998,7 @@
           <w:sz w:val="24"/>
           <w:szCs w:val="24"/>
         </w:rPr>
-        <w:t xml:space="preserve">OpenAI. (2024). “Function Calling.” OpenAI API Documentation.</w:t>
+        <w:t xml:space="preserve">Anthropic. (2025). “Tool Use with Claude.” Anthropic Documentation.</w:t>
       </w:r>
     </w:p>
     <w:p>
@@ -3203,7 +4017,7 @@
           <w:sz w:val="24"/>
           <w:szCs w:val="24"/>
         </w:rPr>
-        <w:t xml:space="preserve">Groq. (2026). “Groq API Documentation.” https://console.groq.com/docs</w:t>
+        <w:t xml:space="preserve">Collin, C. (2024). “Zod: TypeScript-first schema validation with static type inference.” https://zod.dev</w:t>
       </w:r>
     </w:p>
     <w:p>
@@ -3222,7 +4036,26 @@
           <w:sz w:val="24"/>
           <w:szCs w:val="24"/>
         </w:rPr>
-        <w:t xml:space="preserve">Google. (2026). “Gemini API Documentation.” https://ai.google.dev/gemini-api/docs</w:t>
+        <w:t xml:space="preserve">Node-cron. (2026). “Node-cron: Task scheduler for Node.js based on cron syntax.” npm package.</w:t>
+      </w:r>
+    </w:p>
+    <w:p>
+      <w:pPr>
+        <w:pStyle w:val="ListParagraph"/>
+        <w:numPr>
+          <w:ilvl w:val="0"/>
+          <w:numId w:val="2"/>
+        </w:numPr>
+        <w:spacing w:after="60" w:line="240"/>
+      </w:pPr>
+      <w:r>
+        <w:rPr>
+          <w:rFonts w:ascii="Times New Roman" w:cs="Times New Roman" w:eastAsia="Times New Roman" w:hAnsi="Times New Roman"/>
+          <w:color w:val="000000"/>
+          <w:sz w:val="24"/>
+          <w:szCs w:val="24"/>
+        </w:rPr>
+        <w:t xml:space="preserve">OpenAI. (2024). “Function Calling.” OpenAI API Documentation.</w:t>
       </w:r>
     </w:p>
     <w:sectPr>
@@ -3361,7 +4194,7 @@
         <w:sz w:val="18"/>
         <w:szCs w:val="18"/>
       </w:rPr>
-      <w:t xml:space="preserve">LiteClaw: A Lightweight Generative AI Agent Framework</w:t>
+      <w:t xml:space="preserve">LiteClaw: A Lightweight WhatsApp-Driven GenAI Agent Framework</w:t>
     </w:r>
   </w:p>
 </w:hdr>

</xml_diff>

<commit_message>
Optimize report, PPT, and speech with daily-life framing
PPT: life-oriented titles, micro-moment scenario, market gap with
daily-use-fit column, real WhatsApp message examples on demo slide,
"practicality matters" conclusion

Report: added micro-moments intro, user-impact sentences per challenge,
everyday-use lens in literature survey, bounded-usefulness rationale in
architecture/tools/WhatsApp sections, new section 6.5 Real-World
Interaction Reflection, design philosophy conclusion (section 8)

Speech: rewritten for 3 min with daily-life narrative matching new PPT

Co-Authored-By: Claude Opus 4.6 <noreply@anthropic.com>
</commit_message>
<xml_diff>
--- a/docs/report.docx
+++ b/docs/report.docx
@@ -144,7 +144,35 @@
           <w:sz w:val="24"/>
           <w:szCs w:val="24"/>
         </w:rPr>
+        <w:t xml:space="preserve">Many interactions with a personal assistant do not occur when users are seated in front of a computer, but during everyday micro-moments such as commuting, walking between classes, waiting in a queue, or preparing to sleep. In such situations, the desired interaction is usually brief and low-friction: recording an idea, setting a reminder, checking a task, or asking a short question. These moments highlight a mismatch between the realities of daily-life assistant usage and the dominant interfaces of existing AI agent systems, which are typically web-based or terminal-oriented.</w:t>
+      </w:r>
+    </w:p>
+    <w:p>
+      <w:pPr>
+        <w:spacing w:after="120" w:line="240"/>
+      </w:pPr>
+      <w:r>
+        <w:rPr>
+          <w:rFonts w:ascii="Times New Roman" w:cs="Times New Roman" w:eastAsia="Times New Roman" w:hAnsi="Times New Roman"/>
+          <w:color w:val="000000"/>
+          <w:sz w:val="24"/>
+          <w:szCs w:val="24"/>
+        </w:rPr>
         <w:t xml:space="preserve">The emergence of Large Language Models (LLMs) has catalyzed a paradigm shift in artificial intelligence, moving beyond passive text generation toward autonomous agents capable of reasoning about complex tasks and taking concrete actions in the real world. Central to this advancement is the ReAct (Reasoning + Acting) paradigm, introduced by Yao et al. (2023), which demonstrates that LLMs can interleave chain-of-thought reasoning with tool invocations to solve multi-step problems. This paradigm has spawned a new generation of AI agent frameworks that promise to automate complex workflows through natural language interaction.</w:t>
+      </w:r>
+    </w:p>
+    <w:p>
+      <w:pPr>
+        <w:spacing w:after="120" w:line="240"/>
+      </w:pPr>
+      <w:r>
+        <w:rPr>
+          <w:rFonts w:ascii="Times New Roman" w:cs="Times New Roman" w:eastAsia="Times New Roman" w:hAnsi="Times New Roman"/>
+          <w:color w:val="000000"/>
+          <w:sz w:val="24"/>
+          <w:szCs w:val="24"/>
+        </w:rPr>
+        <w:t xml:space="preserve">From this perspective, the challenge is not only to build a capable AI agent, but also to design one that users can realistically reach and use in the flow of everyday life.</w:t>
       </w:r>
     </w:p>
     <w:p>
@@ -352,6 +380,20 @@
       <w:r>
         <w:rPr>
           <w:rFonts w:ascii="Times New Roman" w:cs="Times New Roman" w:eastAsia="Times New Roman" w:hAnsi="Times New Roman"/>
+          <w:color w:val="000000"/>
+          <w:sz w:val="24"/>
+          <w:szCs w:val="24"/>
+        </w:rPr>
+        <w:t xml:space="preserve">These challenges are not merely technical inconveniences. They directly affect whether an AI assistant can become part of a user’s ordinary routine. A personal assistant that is difficult to understand, difficult to trust, expensive to maintain, or inaccessible away from a desktop environment is unlikely to be used consistently, regardless of its raw capability.</w:t>
+      </w:r>
+    </w:p>
+    <w:p>
+      <w:pPr>
+        <w:spacing w:after="120" w:line="240"/>
+      </w:pPr>
+      <w:r>
+        <w:rPr>
+          <w:rFonts w:ascii="Times New Roman" w:cs="Times New Roman" w:eastAsia="Times New Roman" w:hAnsi="Times New Roman"/>
           <w:b/>
           <w:bCs/>
           <w:color w:val="000000"/>
@@ -367,7 +409,7 @@
           <w:sz w:val="24"/>
           <w:szCs w:val="24"/>
         </w:rPr>
-        <w:t xml:space="preserve">Production-grade agent frameworks demand massive codebases and deep software engineering expertise. OpenClaw requires approximately 500,000 lines of code and over 70 dependencies, making it impractical for individual developers to understand, customize, or deploy. Even experienced engineers report spending weeks navigating such codebases before making meaningful contributions. This complexity creates a paradox: the frameworks designed to make AI agents accessible are themselves inaccessible to most developers.</w:t>
+        <w:t xml:space="preserve">Production-grade agent frameworks demand massive codebases and deep software engineering expertise. OpenClaw requires approximately 500,000 lines of code and over 70 dependencies, making it impractical for individual developers to understand, customize, or deploy. Even experienced engineers report spending weeks navigating such codebases before making meaningful contributions. This complexity creates a paradox: the frameworks designed to make AI agents accessible are themselves inaccessible to most developers. For individual developers and student projects, such complexity also makes it difficult to rapidly adapt an agent to personal, real-world use cases.</w:t>
       </w:r>
     </w:p>
     <w:p>
@@ -392,7 +434,7 @@
           <w:sz w:val="24"/>
           <w:szCs w:val="24"/>
         </w:rPr>
-        <w:t xml:space="preserve">AI agents that interact with the host operating system through shell commands and web access pose inherent security risks. An agent with shell access could, through hallucination or prompt injection, execute destructive operations such as recursive file deletion or unauthorized network requests. Path traversal vulnerabilities in file operation tools could allow the agent to access sensitive files outside its designated workspace. Multi-turn agentic loops compound this risk: a single user message may trigger dozens of tool executions, each representing a potential attack surface. Existing lightweight frameworks often omit safety measures entirely, while comprehensive frameworks implement complex but incomplete sandboxing.</w:t>
+        <w:t xml:space="preserve">AI agents that interact with the host operating system through shell commands and web access pose inherent security risks. An agent with shell access could, through hallucination or prompt injection, execute destructive operations such as recursive file deletion or unauthorized network requests. Path traversal vulnerabilities in file operation tools could allow the agent to access sensitive files outside its designated workspace. Multi-turn agentic loops compound this risk: a single user message may trigger dozens of tool executions, each representing a potential attack surface. Existing lightweight frameworks often omit safety measures entirely, while comprehensive frameworks implement complex but incomplete sandboxing. In the context of everyday personal assistance, users often need only a narrow set of bounded functions, such as reminders, notes, tasks, and lightweight file handling, rather than unrestricted operating-system autonomy.</w:t>
       </w:r>
     </w:p>
     <w:p>
@@ -417,7 +459,7 @@
           <w:sz w:val="24"/>
           <w:szCs w:val="24"/>
         </w:rPr>
-        <w:t xml:space="preserve">Web-UI agents require users to be seated at a computer with a browser open. Terminal-based agents demand even more technical sophistication. Neither paradigm serves the most natural use case for a personal AI assistant: quick, mobile interactions throughout the day. WhatsApp, used by over 2 billion people across 180 countries, offers a universally familiar interface that requires no installation, no browser, and no technical setup beyond scanning a QR code. Yet no lightweight agent framework delivers AI assistance through WhatsApp natively.</w:t>
+        <w:t xml:space="preserve">Web-UI agents require users to be seated at a computer with a browser open. Terminal-based agents demand even more technical sophistication. Neither paradigm serves the most natural use case for a personal AI assistant: quick, mobile interactions throughout the day. WhatsApp, used by over 2 billion people across 180 countries, offers a universally familiar interface that requires no installation, no browser, and no technical setup beyond scanning a QR code. Yet no lightweight agent framework delivers AI assistance through WhatsApp natively. This is especially limiting because many assistant interactions are brief, interrupt-driven, and mobile, rather than long-form sessions carried out at a desk.</w:t>
       </w:r>
     </w:p>
     <w:p>
@@ -442,7 +484,7 @@
           <w:sz w:val="24"/>
           <w:szCs w:val="24"/>
         </w:rPr>
-        <w:t xml:space="preserve">Most agent frameworks are tightly coupled to paid LLM providers, typically OpenAI or Anthropic. This creates cost barriers for students, hobbyists, and developers in regions where these APIs are restricted or expensive. Free-tier offerings from Groq (Llama models) and Google Gemini provide competitive quality at zero cost for moderate usage, but few frameworks support them as first-class providers with simple configuration switching.</w:t>
+        <w:t xml:space="preserve">Most agent frameworks are tightly coupled to paid LLM providers, typically OpenAI or Anthropic. This creates cost barriers for students, hobbyists, and developers in regions where these APIs are restricted or expensive. Free-tier offerings from Groq (Llama models) and Google Gemini provide competitive quality at zero cost for moderate usage, but few frameworks support them as first-class providers with simple configuration switching. If routine experimentation and everyday interaction incur ongoing cost pressure, the assistant is less likely to become a sustainable habit for students, hobbyists, or individual users.</w:t>
       </w:r>
     </w:p>
     <w:p>
@@ -506,6 +548,20 @@
           <w:szCs w:val="28"/>
         </w:rPr>
         <w:t xml:space="preserve">3.1 AI Agent Frameworks</w:t>
+      </w:r>
+    </w:p>
+    <w:p>
+      <w:pPr>
+        <w:spacing w:after="120" w:line="240"/>
+      </w:pPr>
+      <w:r>
+        <w:rPr>
+          <w:rFonts w:ascii="Times New Roman" w:cs="Times New Roman" w:eastAsia="Times New Roman" w:hAnsi="Times New Roman"/>
+          <w:color w:val="000000"/>
+          <w:sz w:val="24"/>
+          <w:szCs w:val="24"/>
+        </w:rPr>
+        <w:t xml:space="preserve">Existing agent frameworks are often evaluated in terms of capability, extensibility, and autonomy. However, for personal AI assistance, day-to-day usability is equally important. Relevant criteria include how quickly the user can reach the agent, how much context switching is required, whether the interaction fits an existing communication habit, and whether the system’s behavior remains understandable and trustworthy during routine use.</w:t>
       </w:r>
     </w:p>
     <w:p>
@@ -2084,6 +2140,20 @@
           <w:sz w:val="24"/>
           <w:szCs w:val="24"/>
         </w:rPr>
+        <w:t xml:space="preserve">Viewed through this everyday-use lens, the current landscape reveals a practical gap. High-capability frameworks optimize for generality and power, while commercial messaging bots optimize for business workflow automation. Neither category is primarily designed for low-friction, personally useful, daily interaction through a familiar messaging interface.</w:t>
+      </w:r>
+    </w:p>
+    <w:p>
+      <w:pPr>
+        <w:spacing w:after="120" w:line="240"/>
+      </w:pPr>
+      <w:r>
+        <w:rPr>
+          <w:rFonts w:ascii="Times New Roman" w:cs="Times New Roman" w:eastAsia="Times New Roman" w:hAnsi="Times New Roman"/>
+          <w:color w:val="000000"/>
+          <w:sz w:val="24"/>
+          <w:szCs w:val="24"/>
+        </w:rPr>
         <w:t xml:space="preserve">Our survey reveals a clear gap in the market: no existing solution combines (1) lightweight, understandable code, (2) LLM-powered agent reasoning, (3) native WhatsApp delivery, (4) local-only tool execution with security guarantees, and (5) free LLM support. LiteClaw is designed to fill this gap by combining the simplicity of NanoClaw-class frameworks with WhatsApp delivery, multi-provider LLM support, and a comprehensive security model — all in approximately 1,800 lines of TypeScript.</w:t>
       </w:r>
     </w:p>
@@ -3147,6 +3217,20 @@
     </w:tbl>
     <w:p>
       <w:pPr>
+        <w:spacing w:after="120" w:line="240"/>
+      </w:pPr>
+      <w:r>
+        <w:rPr>
+          <w:rFonts w:ascii="Times New Roman" w:cs="Times New Roman" w:eastAsia="Times New Roman" w:hAnsi="Times New Roman"/>
+          <w:color w:val="000000"/>
+          <w:sz w:val="24"/>
+          <w:szCs w:val="24"/>
+        </w:rPr>
+        <w:t xml:space="preserve">This architectural choice reflects a deliberate design trade-off. Rather than maximizing open-ended autonomy, LiteClaw prioritizes bounded usefulness for everyday personal assistance. The aim is to support frequent, lightweight interactions in a manner that remains understandable, auditable, and safe enough for routine use on a personal device-linked channel such as WhatsApp.</w:t>
+      </w:r>
+    </w:p>
+    <w:p>
+      <w:pPr>
         <w:spacing w:after="120" w:before="120" w:line="240"/>
         <w:jc w:val="center"/>
       </w:pPr>
@@ -3294,6 +3378,20 @@
           <w:szCs w:val="24"/>
         </w:rPr>
         <w:t xml:space="preserve">When the LLM produces output that does not parse as valid JSON or fails Zod schema validation, the DecisionParseError handler generates a safe fallback reply informing the user of the error, rather than silently failing or retrying.</w:t>
+      </w:r>
+    </w:p>
+    <w:p>
+      <w:pPr>
+        <w:spacing w:after="120" w:line="240"/>
+      </w:pPr>
+      <w:r>
+        <w:rPr>
+          <w:rFonts w:ascii="Times New Roman" w:cs="Times New Roman" w:eastAsia="Times New Roman" w:hAnsi="Times New Roman"/>
+          <w:color w:val="000000"/>
+          <w:sz w:val="24"/>
+          <w:szCs w:val="24"/>
+        </w:rPr>
+        <w:t xml:space="preserve">This bounded decision model is particularly appropriate for personal daily-use assistants. In such contexts, users often value reliability, predictability, and trust more than unconstrained multi-step autonomy. A system that consistently performs one understandable action per message is easier to reason about and more compatible with routine human use than one that may trigger extended internal action chains.</w:t>
       </w:r>
     </w:p>
     <w:p>
@@ -3928,6 +4026,20 @@
     </w:p>
     <w:p>
       <w:pPr>
+        <w:spacing w:after="120" w:line="240"/>
+      </w:pPr>
+      <w:r>
+        <w:rPr>
+          <w:rFonts w:ascii="Times New Roman" w:cs="Times New Roman" w:eastAsia="Times New Roman" w:hAnsi="Times New Roman"/>
+          <w:color w:val="000000"/>
+          <w:sz w:val="24"/>
+          <w:szCs w:val="24"/>
+        </w:rPr>
+        <w:t xml:space="preserve">The restriction to local-only, bounded tools is not merely a defensive security measure; it also reflects the practical scope of many personal assistant interactions. For everyday use, common needs include writing short notes, managing tasks, setting reminders, and accessing lightweight personal files. By focusing on this narrower but high-frequency task range, LiteClaw reduces both technical risk and user trust burden without sacrificing core usefulness.</w:t>
+      </w:r>
+    </w:p>
+    <w:p>
+      <w:pPr>
         <w:spacing w:after="120" w:before="240" w:line="240"/>
         <w:jc w:val="center"/>
       </w:pPr>
@@ -4668,7 +4780,7 @@
           <w:sz w:val="24"/>
           <w:szCs w:val="24"/>
         </w:rPr>
-        <w:t xml:space="preserve">The WhatsApp channel uses the @whiskeysockets/baileys library for multi-device WhatsApp Web connectivity. On first startup, the system generates a QR code in the terminal; the user scans it with their phone’s WhatsApp “Link a Device” feature. Subsequent connections use saved credentials from the whatsapp-auth/ directory, requiring no re-authentication.</w:t>
+        <w:t xml:space="preserve">The WhatsApp channel uses the @whiskeysockets/baileys library for multi-device WhatsApp Web connectivity. On first startup, the system generates a QR code in the terminal; the user scans it with their phone’s WhatsApp “Link a Device” feature. Subsequent connections use saved credentials from the whatsapp-auth/ directory, requiring no re-authentication. The value of WhatsApp delivery is not only its scale, but also its behavioral familiarity. For many users, sending a short message is already a deeply habitual action. Embedding the assistant into this familiar channel reduces interaction friction and makes it more plausible that the agent will be used in brief, real-world moments rather than only in deliberate desktop sessions.</w:t>
       </w:r>
     </w:p>
     <w:p>
@@ -6968,7 +7080,7 @@
     <w:p>
       <w:pPr>
         <w:spacing w:after="120" w:before="240" w:line="240"/>
-        <w:jc w:val="center"/>
+        <w:jc w:val="left"/>
       </w:pPr>
       <w:r>
         <w:rPr>
@@ -6976,6 +7088,65 @@
           <w:b/>
           <w:bCs/>
           <w:color w:val="000000"/>
+          <w:sz w:val="28"/>
+          <w:szCs w:val="28"/>
+        </w:rPr>
+        <w:t xml:space="preserve">6.5 Real-World Interaction Reflection</w:t>
+      </w:r>
+    </w:p>
+    <w:p>
+      <w:pPr>
+        <w:spacing w:after="120" w:line="240"/>
+      </w:pPr>
+      <w:r>
+        <w:rPr>
+          <w:rFonts w:ascii="Times New Roman" w:cs="Times New Roman" w:eastAsia="Times New Roman" w:hAnsi="Times New Roman"/>
+          <w:color w:val="000000"/>
+          <w:sz w:val="24"/>
+          <w:szCs w:val="24"/>
+        </w:rPr>
+        <w:t xml:space="preserve">Beyond technical correctness, LiteClaw was also considered from the perspective of everyday interaction. In informal practical use, the framework appeared most effective for short, interrupt-driven tasks such as capturing reminders, recording brief notes, checking pending tasks, and handling lightweight conversational requests. These are situations in which the cost of opening a dedicated application or desktop interface may exceed the value of the task itself, whereas sending a message through WhatsApp remains fast and behaviorally natural.</w:t>
+      </w:r>
+    </w:p>
+    <w:p>
+      <w:pPr>
+        <w:spacing w:after="120" w:line="240"/>
+      </w:pPr>
+      <w:r>
+        <w:rPr>
+          <w:rFonts w:ascii="Times New Roman" w:cs="Times New Roman" w:eastAsia="Times New Roman" w:hAnsi="Times New Roman"/>
+          <w:color w:val="000000"/>
+          <w:sz w:val="24"/>
+          <w:szCs w:val="24"/>
+        </w:rPr>
+        <w:t xml:space="preserve">This observation suggests that LiteClaw’s main advantage is not maximal task complexity, but reduced interaction friction. The framework is particularly suitable for micro-tasks that benefit from immediacy and low setup overhead. At the same time, its limitations are equally clear: it is less appropriate for document-heavy workflows, complex visual tasks, or extended planning sessions that benefit from a richer graphical interface. In this sense, LiteClaw should be understood not as a universal interface for all AI assistance, but as a practical design for a specific and meaningful class of everyday personal interactions.</w:t>
+      </w:r>
+    </w:p>
+    <w:p>
+      <w:pPr>
+        <w:spacing w:after="120" w:line="240"/>
+      </w:pPr>
+      <w:r>
+        <w:rPr>
+          <w:rFonts w:ascii="Times New Roman" w:cs="Times New Roman" w:eastAsia="Times New Roman" w:hAnsi="Times New Roman"/>
+          <w:color w:val="000000"/>
+          <w:sz w:val="24"/>
+          <w:szCs w:val="24"/>
+        </w:rPr>
+        <w:t xml:space="preserve">These reflections are consistent with the original design rationale of the system: bounded functionality, familiar interaction, and low-friction accessibility are not incidental properties, but central design goals for personal AI assistance in daily life.</w:t>
+      </w:r>
+    </w:p>
+    <w:p>
+      <w:pPr>
+        <w:spacing w:after="120" w:before="240" w:line="240"/>
+        <w:jc w:val="center"/>
+      </w:pPr>
+      <w:r>
+        <w:rPr>
+          <w:rFonts w:ascii="Times New Roman" w:cs="Times New Roman" w:eastAsia="Times New Roman" w:hAnsi="Times New Roman"/>
+          <w:b/>
+          <w:bCs/>
+          <w:color w:val="000000"/>
           <w:sz w:val="32"/>
           <w:szCs w:val="32"/>
         </w:rPr>
@@ -7106,6 +7277,65 @@
           <w:szCs w:val="24"/>
         </w:rPr>
         <w:t xml:space="preserve">[QR Code for demo video link — to be inserted]</w:t>
+      </w:r>
+    </w:p>
+    <w:p>
+      <w:pPr>
+        <w:spacing w:after="120" w:before="240" w:line="240"/>
+        <w:jc w:val="center"/>
+      </w:pPr>
+      <w:r>
+        <w:rPr>
+          <w:rFonts w:ascii="Times New Roman" w:cs="Times New Roman" w:eastAsia="Times New Roman" w:hAnsi="Times New Roman"/>
+          <w:b/>
+          <w:bCs/>
+          <w:color w:val="000000"/>
+          <w:sz w:val="32"/>
+          <w:szCs w:val="32"/>
+        </w:rPr>
+        <w:t xml:space="preserve">8. Conclusion</w:t>
+      </w:r>
+    </w:p>
+    <w:p>
+      <w:pPr>
+        <w:spacing w:after="120" w:line="240"/>
+      </w:pPr>
+      <w:r>
+        <w:rPr>
+          <w:rFonts w:ascii="Times New Roman" w:cs="Times New Roman" w:eastAsia="Times New Roman" w:hAnsi="Times New Roman"/>
+          <w:color w:val="000000"/>
+          <w:sz w:val="24"/>
+          <w:szCs w:val="24"/>
+        </w:rPr>
+        <w:t xml:space="preserve">LiteClaw suggests that the practical value of a personal AI assistant depends not only on capability, but also on reachability, bounded trust, and compatibility with everyday behavior. By combining lightweight implementation, safe local tool execution, and WhatsApp-native interaction, the project shows that an agent can be designed around routine human use rather than around maximal autonomy alone.</w:t>
+      </w:r>
+    </w:p>
+    <w:p>
+      <w:pPr>
+        <w:spacing w:after="120" w:line="240"/>
+      </w:pPr>
+      <w:r>
+        <w:rPr>
+          <w:rFonts w:ascii="Times New Roman" w:cs="Times New Roman" w:eastAsia="Times New Roman" w:hAnsi="Times New Roman"/>
+          <w:color w:val="000000"/>
+          <w:sz w:val="24"/>
+          <w:szCs w:val="24"/>
+        </w:rPr>
+        <w:t xml:space="preserve">More broadly, this work argues that everyday usefulness should be treated as a first-class design goal in GenAI agent development. For personal assistants, systems that are understandable, low-friction, and realistically usable in ordinary life may be more impactful than systems that are merely more powerful in abstract capability terms.</w:t>
+      </w:r>
+    </w:p>
+    <w:p>
+      <w:pPr>
+        <w:spacing w:after="120" w:line="240"/>
+      </w:pPr>
+      <w:r>
+        <w:rPr>
+          <w:rFonts w:ascii="Times New Roman" w:cs="Times New Roman" w:eastAsia="Times New Roman" w:hAnsi="Times New Roman"/>
+          <w:color w:val="000000"/>
+          <w:sz w:val="24"/>
+          <w:szCs w:val="24"/>
+        </w:rPr>
+        <w:t xml:space="preserve">Future directions include multi-platform support (Telegram, Signal), voice message transcription for hands-free interaction, RAG-based memory retrieval for improved contextual recall, and multi-user authentication with session isolation for shared-device scenarios.</w:t>
       </w:r>
     </w:p>
     <w:p>

</xml_diff>